<commit_message>
List 18 Task#99 Academic coversheet Export-Mistrial
</commit_message>
<xml_diff>
--- a/StudentBinder/ASTemplates/ASTemplates1.docx
+++ b/StudentBinder/ASTemplates/ASTemplates1.docx
@@ -1,6 +1,6 @@
 
 <file path=word/document.xml><?xml version="1.0" encoding="utf-8"?>
-<w:document xmlns:wpc="http://schemas.microsoft.com/office/word/2010/wordprocessingCanvas" xmlns:mc="http://schemas.openxmlformats.org/markup-compatibility/2006" xmlns:o="urn:schemas-microsoft-com:office:office" xmlns:r="http://schemas.openxmlformats.org/officeDocument/2006/relationships" xmlns:m="http://schemas.openxmlformats.org/officeDocument/2006/math" xmlns:v="urn:schemas-microsoft-com:vml" xmlns:wp14="http://schemas.microsoft.com/office/word/2010/wordprocessingDrawing" xmlns:wp="http://schemas.openxmlformats.org/drawingml/2006/wordprocessingDrawing" xmlns:w10="urn:schemas-microsoft-com:office:word" xmlns:w="http://schemas.openxmlformats.org/wordprocessingml/2006/main" xmlns:w14="http://schemas.microsoft.com/office/word/2010/wordml" xmlns:w15="http://schemas.microsoft.com/office/word/2012/wordml" xmlns:wpg="http://schemas.microsoft.com/office/word/2010/wordprocessingGroup" xmlns:wpi="http://schemas.microsoft.com/office/word/2010/wordprocessingInk" xmlns:wne="http://schemas.microsoft.com/office/word/2006/wordml" xmlns:wps="http://schemas.microsoft.com/office/word/2010/wordprocessingShape" mc:Ignorable="w14 w15 wp14">
+<w:document xmlns:wpc="http://schemas.microsoft.com/office/word/2010/wordprocessingCanvas" xmlns:mc="http://schemas.openxmlformats.org/markup-compatibility/2006" xmlns:o="urn:schemas-microsoft-com:office:office" xmlns:r="http://schemas.openxmlformats.org/officeDocument/2006/relationships" xmlns:m="http://schemas.openxmlformats.org/officeDocument/2006/math" xmlns:v="urn:schemas-microsoft-com:vml" xmlns:wp14="http://schemas.microsoft.com/office/word/2010/wordprocessingDrawing" xmlns:wp="http://schemas.openxmlformats.org/drawingml/2006/wordprocessingDrawing" xmlns:w10="urn:schemas-microsoft-com:office:word" xmlns:w="http://schemas.openxmlformats.org/wordprocessingml/2006/main" xmlns:w14="http://schemas.microsoft.com/office/word/2010/wordml" xmlns:wpg="http://schemas.microsoft.com/office/word/2010/wordprocessingGroup" xmlns:wpi="http://schemas.microsoft.com/office/word/2010/wordprocessingInk" xmlns:wne="http://schemas.microsoft.com/office/word/2006/wordml" xmlns:wps="http://schemas.microsoft.com/office/word/2010/wordprocessingShape" mc:Ignorable="w14 wp14">
   <w:body>
     <w:p>
       <w:pPr>
@@ -41,7 +41,6 @@
             <w:r>
               <w:rPr>
                 <w:noProof/>
-                <w:lang w:val="en-IN" w:eastAsia="en-IN"/>
               </w:rPr>
               <w:drawing>
                 <wp:inline distT="0" distB="0" distL="0" distR="0">
@@ -61,12 +60,12 @@
                           </pic:cNvPicPr>
                         </pic:nvPicPr>
                         <pic:blipFill>
-                          <a:blip r:embed="rId7"/>
+                          <a:blip r:embed="rId8"/>
                           <a:stretch>
                             <a:fillRect/>
                           </a:stretch>
                         </pic:blipFill>
-                        <pic:spPr bwMode="auto">
+                        <pic:spPr>
                           <a:xfrm>
                             <a:off x="0" y="0"/>
                             <a:ext cx="1820545" cy="544195"/>
@@ -141,6 +140,8 @@
         </w:rPr>
         <w:t xml:space="preserve">              </w:t>
       </w:r>
+      <w:bookmarkStart w:id="0" w:name="_GoBack"/>
+      <w:bookmarkEnd w:id="0"/>
     </w:p>
     <w:p>
       <w:pPr>
@@ -170,6 +171,7 @@
         </w:rPr>
         <w:t xml:space="preserve">: (2) </w:t>
       </w:r>
+      <w:proofErr w:type="spellStart"/>
       <w:r>
         <w:rPr>
           <w:rFonts w:ascii="Arial" w:hAnsi="Arial" w:cs="Arial"/>
@@ -179,6 +181,7 @@
         </w:rPr>
         <w:t>PlcGoalArea</w:t>
       </w:r>
+      <w:proofErr w:type="spellEnd"/>
     </w:p>
     <w:tbl>
       <w:tblPr>
@@ -321,6 +324,7 @@
                 <w:szCs w:val="20"/>
               </w:rPr>
             </w:pPr>
+            <w:proofErr w:type="spellStart"/>
             <w:r>
               <w:rPr>
                 <w:rFonts w:ascii="Arial" w:hAnsi="Arial" w:cs="Arial"/>
@@ -330,6 +334,7 @@
               </w:rPr>
               <w:t>PlcStudentName</w:t>
             </w:r>
+            <w:proofErr w:type="spellEnd"/>
           </w:p>
         </w:tc>
         <w:tc>
@@ -352,6 +357,7 @@
                 <w:szCs w:val="20"/>
               </w:rPr>
             </w:pPr>
+            <w:proofErr w:type="spellStart"/>
             <w:r>
               <w:rPr>
                 <w:rFonts w:ascii="Arial" w:hAnsi="Arial" w:cs="Arial"/>
@@ -361,6 +367,7 @@
               </w:rPr>
               <w:t>PlcIEPDate</w:t>
             </w:r>
+            <w:proofErr w:type="spellEnd"/>
           </w:p>
         </w:tc>
         <w:tc>
@@ -383,6 +390,7 @@
                 <w:szCs w:val="20"/>
               </w:rPr>
             </w:pPr>
+            <w:proofErr w:type="spellStart"/>
             <w:r>
               <w:rPr>
                 <w:rFonts w:ascii="Arial" w:hAnsi="Arial" w:cs="Arial"/>
@@ -392,6 +400,7 @@
               </w:rPr>
               <w:t>PlcMeetingDate</w:t>
             </w:r>
+            <w:proofErr w:type="spellEnd"/>
           </w:p>
         </w:tc>
       </w:tr>
@@ -426,6 +435,7 @@
         </w:rPr>
         <w:t xml:space="preserve">: </w:t>
       </w:r>
+      <w:proofErr w:type="spellStart"/>
       <w:r>
         <w:rPr>
           <w:rFonts w:ascii="Arial" w:hAnsi="Arial" w:cs="Arial"/>
@@ -436,6 +446,7 @@
         </w:rPr>
         <w:t>PlcGoal</w:t>
       </w:r>
+      <w:proofErr w:type="spellEnd"/>
     </w:p>
     <w:tbl>
       <w:tblPr>
@@ -507,6 +518,7 @@
                 <w:sz w:val="18"/>
               </w:rPr>
             </w:pPr>
+            <w:proofErr w:type="spellStart"/>
             <w:r>
               <w:rPr>
                 <w:rFonts w:ascii="Arial" w:hAnsi="Arial" w:cs="Arial"/>
@@ -518,6 +530,7 @@
               </w:rPr>
               <w:t>plcBenchmarkGoa</w:t>
             </w:r>
+            <w:proofErr w:type="spellEnd"/>
             <w:r>
               <w:rPr>
                 <w:rFonts w:ascii="Arial" w:hAnsi="Arial" w:cs="Arial"/>
@@ -654,6 +667,7 @@
               </w:rPr>
               <w:t xml:space="preserve">   </w:t>
             </w:r>
+            <w:proofErr w:type="spellStart"/>
             <w:r>
               <w:rPr>
                 <w:rFonts w:ascii="Arial" w:eastAsia="Consolas" w:hAnsi="Arial" w:cs="Arial"/>
@@ -664,6 +678,7 @@
               </w:rPr>
               <w:t>PlcCurrent</w:t>
             </w:r>
+            <w:proofErr w:type="spellEnd"/>
           </w:p>
         </w:tc>
       </w:tr>
@@ -1305,7 +1320,17 @@
                 <w:sz w:val="16"/>
                 <w:szCs w:val="16"/>
               </w:rPr>
-              <w:t>Type of Instruction</w:t>
+              <w:t xml:space="preserve">Type of </w:t>
+            </w:r>
+            <w:r>
+              <w:rPr>
+                <w:rFonts w:ascii="Arial" w:hAnsi="Arial" w:cs="Arial"/>
+                <w:b/>
+                <w:color w:val="000000" w:themeColor="text1"/>
+                <w:sz w:val="16"/>
+                <w:szCs w:val="16"/>
+              </w:rPr>
+              <w:t>Instruction</w:t>
             </w:r>
             <w:r>
               <w:rPr>
@@ -2447,18 +2472,20 @@
                 <w:sz w:val="16"/>
                 <w:szCs w:val="16"/>
               </w:rPr>
-              <w:t>IOA (</w:t>
-            </w:r>
-            <w:r>
-              <w:rPr>
-                <w:rFonts w:ascii="Arial" w:hAnsi="Arial" w:cs="Arial"/>
-                <w:b/>
-                <w:color w:val="000000" w:themeColor="text1"/>
-                <w:sz w:val="16"/>
-                <w:szCs w:val="16"/>
-              </w:rPr>
-              <w:t>IOAs/Avg</w:t>
-            </w:r>
+              <w:t>IOA (IOAs/</w:t>
+            </w:r>
+            <w:proofErr w:type="spellStart"/>
+            <w:r>
+              <w:rPr>
+                <w:rFonts w:ascii="Arial" w:hAnsi="Arial" w:cs="Arial"/>
+                <w:b/>
+                <w:color w:val="000000" w:themeColor="text1"/>
+                <w:sz w:val="16"/>
+                <w:szCs w:val="16"/>
+              </w:rPr>
+              <w:t>Avg</w:t>
+            </w:r>
+            <w:proofErr w:type="spellEnd"/>
             <w:r>
               <w:rPr>
                 <w:rFonts w:ascii="Arial" w:hAnsi="Arial" w:cs="Arial"/>
@@ -2532,8 +2559,6 @@
               </w:rPr>
               <w:t>Ioa2</w:t>
             </w:r>
-            <w:bookmarkStart w:id="0" w:name="_GoBack"/>
-            <w:bookmarkEnd w:id="0"/>
           </w:p>
         </w:tc>
         <w:tc>
@@ -2775,7 +2800,6 @@
                 <w:color w:val="000000" w:themeColor="text1"/>
                 <w:sz w:val="16"/>
                 <w:szCs w:val="16"/>
-                <w:highlight w:val="yellow"/>
               </w:rPr>
             </w:pPr>
             <w:r>
@@ -2788,6 +2812,45 @@
               <w:t>Plcnum1</w:t>
             </w:r>
           </w:p>
+          <w:p>
+            <w:pPr>
+              <w:jc w:val="center"/>
+              <w:rPr>
+                <w:rFonts w:ascii="Arial" w:hAnsi="Arial" w:cs="Arial"/>
+                <w:color w:val="000000" w:themeColor="text1"/>
+                <w:sz w:val="16"/>
+                <w:szCs w:val="16"/>
+              </w:rPr>
+            </w:pPr>
+          </w:p>
+          <w:p>
+            <w:pPr>
+              <w:jc w:val="center"/>
+              <w:rPr>
+                <w:rFonts w:ascii="Arial" w:hAnsi="Arial" w:cs="Arial"/>
+                <w:sz w:val="14"/>
+                <w:szCs w:val="14"/>
+                <w:lang w:val="en-GB"/>
+              </w:rPr>
+            </w:pPr>
+            <w:r>
+              <w:rPr>
+                <w:rFonts w:ascii="Arial" w:eastAsia="Cascadia Mono" w:hAnsi="Arial" w:cs="Arial"/>
+                <w:sz w:val="14"/>
+                <w:szCs w:val="14"/>
+                <w:highlight w:val="white"/>
+              </w:rPr>
+              <w:t>Plcmis1</w:t>
+            </w:r>
+            <w:r>
+              <w:rPr>
+                <w:rFonts w:ascii="Arial" w:eastAsia="Cascadia Mono" w:hAnsi="Arial" w:cs="Arial"/>
+                <w:sz w:val="14"/>
+                <w:szCs w:val="14"/>
+              </w:rPr>
+              <w:t xml:space="preserve"> Mistrials</w:t>
+            </w:r>
+          </w:p>
         </w:tc>
         <w:tc>
           <w:tcPr>
@@ -2807,7 +2870,6 @@
                 <w:color w:val="000000" w:themeColor="text1"/>
                 <w:sz w:val="16"/>
                 <w:szCs w:val="16"/>
-                <w:highlight w:val="yellow"/>
               </w:rPr>
             </w:pPr>
             <w:r>
@@ -2820,6 +2882,45 @@
               <w:t>Plcnum2</w:t>
             </w:r>
           </w:p>
+          <w:p>
+            <w:pPr>
+              <w:jc w:val="center"/>
+              <w:rPr>
+                <w:rFonts w:ascii="Arial" w:hAnsi="Arial" w:cs="Arial"/>
+                <w:color w:val="000000" w:themeColor="text1"/>
+                <w:sz w:val="16"/>
+                <w:szCs w:val="16"/>
+              </w:rPr>
+            </w:pPr>
+          </w:p>
+          <w:p>
+            <w:pPr>
+              <w:jc w:val="center"/>
+              <w:rPr>
+                <w:rFonts w:ascii="Arial" w:hAnsi="Arial" w:cs="Arial"/>
+                <w:sz w:val="14"/>
+                <w:szCs w:val="14"/>
+                <w:lang w:val="en-GB"/>
+              </w:rPr>
+            </w:pPr>
+            <w:r>
+              <w:rPr>
+                <w:rFonts w:ascii="Arial" w:eastAsia="Cascadia Mono" w:hAnsi="Arial" w:cs="Arial"/>
+                <w:sz w:val="14"/>
+                <w:szCs w:val="14"/>
+                <w:highlight w:val="white"/>
+              </w:rPr>
+              <w:t>Plcmis2</w:t>
+            </w:r>
+            <w:r>
+              <w:rPr>
+                <w:rFonts w:ascii="Arial" w:eastAsia="Cascadia Mono" w:hAnsi="Arial" w:cs="Arial"/>
+                <w:sz w:val="14"/>
+                <w:szCs w:val="14"/>
+              </w:rPr>
+              <w:t xml:space="preserve"> Mistrials</w:t>
+            </w:r>
+          </w:p>
         </w:tc>
         <w:tc>
           <w:tcPr>
@@ -2839,7 +2940,6 @@
                 <w:color w:val="000000" w:themeColor="text1"/>
                 <w:sz w:val="16"/>
                 <w:szCs w:val="16"/>
-                <w:highlight w:val="yellow"/>
               </w:rPr>
             </w:pPr>
             <w:r>
@@ -2852,6 +2952,45 @@
               <w:t>Plcnum3</w:t>
             </w:r>
           </w:p>
+          <w:p>
+            <w:pPr>
+              <w:jc w:val="center"/>
+              <w:rPr>
+                <w:rFonts w:ascii="Arial" w:hAnsi="Arial" w:cs="Arial"/>
+                <w:color w:val="000000" w:themeColor="text1"/>
+                <w:sz w:val="16"/>
+                <w:szCs w:val="16"/>
+              </w:rPr>
+            </w:pPr>
+          </w:p>
+          <w:p>
+            <w:pPr>
+              <w:jc w:val="center"/>
+              <w:rPr>
+                <w:rFonts w:ascii="Arial" w:hAnsi="Arial" w:cs="Arial"/>
+                <w:sz w:val="14"/>
+                <w:szCs w:val="14"/>
+                <w:lang w:val="en-GB"/>
+              </w:rPr>
+            </w:pPr>
+            <w:r>
+              <w:rPr>
+                <w:rFonts w:ascii="Arial" w:eastAsia="Cascadia Mono" w:hAnsi="Arial" w:cs="Arial"/>
+                <w:sz w:val="14"/>
+                <w:szCs w:val="14"/>
+                <w:highlight w:val="white"/>
+              </w:rPr>
+              <w:t>Plcmis3</w:t>
+            </w:r>
+            <w:r>
+              <w:rPr>
+                <w:rFonts w:ascii="Arial" w:eastAsia="Cascadia Mono" w:hAnsi="Arial" w:cs="Arial"/>
+                <w:sz w:val="14"/>
+                <w:szCs w:val="14"/>
+              </w:rPr>
+              <w:t xml:space="preserve"> Mistrials</w:t>
+            </w:r>
+          </w:p>
         </w:tc>
         <w:tc>
           <w:tcPr>
@@ -2871,7 +3010,6 @@
                 <w:color w:val="000000" w:themeColor="text1"/>
                 <w:sz w:val="16"/>
                 <w:szCs w:val="16"/>
-                <w:highlight w:val="yellow"/>
               </w:rPr>
             </w:pPr>
             <w:r>
@@ -2882,6 +3020,53 @@
                 <w:szCs w:val="16"/>
               </w:rPr>
               <w:t>Plcnum4</w:t>
+            </w:r>
+          </w:p>
+          <w:p>
+            <w:pPr>
+              <w:jc w:val="center"/>
+              <w:rPr>
+                <w:rFonts w:ascii="Arial" w:hAnsi="Arial" w:cs="Arial"/>
+                <w:color w:val="000000" w:themeColor="text1"/>
+                <w:sz w:val="16"/>
+                <w:szCs w:val="16"/>
+              </w:rPr>
+            </w:pPr>
+          </w:p>
+          <w:p>
+            <w:pPr>
+              <w:jc w:val="center"/>
+              <w:rPr>
+                <w:rFonts w:ascii="Arial" w:hAnsi="Arial" w:cs="Arial"/>
+                <w:sz w:val="14"/>
+                <w:szCs w:val="14"/>
+                <w:lang w:val="en-GB"/>
+              </w:rPr>
+            </w:pPr>
+            <w:r>
+              <w:rPr>
+                <w:rFonts w:ascii="Arial" w:eastAsia="Cascadia Mono" w:hAnsi="Arial" w:cs="Arial"/>
+                <w:sz w:val="14"/>
+                <w:szCs w:val="14"/>
+                <w:highlight w:val="white"/>
+              </w:rPr>
+              <w:t>Plcmis4</w:t>
+            </w:r>
+            <w:r>
+              <w:rPr>
+                <w:rFonts w:ascii="Arial" w:eastAsia="Cascadia Mono" w:hAnsi="Arial" w:cs="Arial"/>
+                <w:sz w:val="14"/>
+                <w:szCs w:val="14"/>
+              </w:rPr>
+              <w:t xml:space="preserve"> Mistria</w:t>
+            </w:r>
+            <w:r>
+              <w:rPr>
+                <w:rFonts w:ascii="Arial" w:eastAsia="Cascadia Mono" w:hAnsi="Arial" w:cs="Arial"/>
+                <w:sz w:val="14"/>
+                <w:szCs w:val="14"/>
+              </w:rPr>
+              <w:t>ls</w:t>
             </w:r>
           </w:p>
         </w:tc>
@@ -2904,7 +3089,6 @@
                 <w:color w:val="000000" w:themeColor="text1"/>
                 <w:sz w:val="16"/>
                 <w:szCs w:val="16"/>
-                <w:highlight w:val="yellow"/>
               </w:rPr>
             </w:pPr>
             <w:r>
@@ -2917,6 +3101,45 @@
               <w:t>Plcnum5</w:t>
             </w:r>
           </w:p>
+          <w:p>
+            <w:pPr>
+              <w:jc w:val="center"/>
+              <w:rPr>
+                <w:rFonts w:ascii="Arial" w:hAnsi="Arial" w:cs="Arial"/>
+                <w:color w:val="000000" w:themeColor="text1"/>
+                <w:sz w:val="16"/>
+                <w:szCs w:val="16"/>
+              </w:rPr>
+            </w:pPr>
+          </w:p>
+          <w:p>
+            <w:pPr>
+              <w:jc w:val="center"/>
+              <w:rPr>
+                <w:rFonts w:ascii="Arial" w:hAnsi="Arial" w:cs="Arial"/>
+                <w:sz w:val="14"/>
+                <w:szCs w:val="14"/>
+                <w:lang w:val="en-GB"/>
+              </w:rPr>
+            </w:pPr>
+            <w:r>
+              <w:rPr>
+                <w:rFonts w:ascii="Arial" w:eastAsia="Cascadia Mono" w:hAnsi="Arial" w:cs="Arial"/>
+                <w:sz w:val="14"/>
+                <w:szCs w:val="14"/>
+                <w:highlight w:val="white"/>
+              </w:rPr>
+              <w:t>Plcmis5</w:t>
+            </w:r>
+            <w:r>
+              <w:rPr>
+                <w:rFonts w:ascii="Arial" w:eastAsia="Cascadia Mono" w:hAnsi="Arial" w:cs="Arial"/>
+                <w:sz w:val="14"/>
+                <w:szCs w:val="14"/>
+              </w:rPr>
+              <w:t xml:space="preserve"> Mistrials</w:t>
+            </w:r>
+          </w:p>
         </w:tc>
         <w:tc>
           <w:tcPr>
@@ -2936,7 +3159,6 @@
                 <w:color w:val="000000" w:themeColor="text1"/>
                 <w:sz w:val="16"/>
                 <w:szCs w:val="16"/>
-                <w:highlight w:val="yellow"/>
               </w:rPr>
             </w:pPr>
             <w:r>
@@ -2949,6 +3171,45 @@
               <w:t>Plcnum6</w:t>
             </w:r>
           </w:p>
+          <w:p>
+            <w:pPr>
+              <w:jc w:val="center"/>
+              <w:rPr>
+                <w:rFonts w:ascii="Arial" w:hAnsi="Arial" w:cs="Arial"/>
+                <w:color w:val="000000" w:themeColor="text1"/>
+                <w:sz w:val="16"/>
+                <w:szCs w:val="16"/>
+              </w:rPr>
+            </w:pPr>
+          </w:p>
+          <w:p>
+            <w:pPr>
+              <w:jc w:val="center"/>
+              <w:rPr>
+                <w:rFonts w:ascii="Arial" w:hAnsi="Arial" w:cs="Arial"/>
+                <w:sz w:val="14"/>
+                <w:szCs w:val="14"/>
+                <w:lang w:val="en-GB"/>
+              </w:rPr>
+            </w:pPr>
+            <w:r>
+              <w:rPr>
+                <w:rFonts w:ascii="Arial" w:eastAsia="Cascadia Mono" w:hAnsi="Arial" w:cs="Arial"/>
+                <w:sz w:val="14"/>
+                <w:szCs w:val="14"/>
+                <w:highlight w:val="white"/>
+              </w:rPr>
+              <w:t>Plcmis6</w:t>
+            </w:r>
+            <w:r>
+              <w:rPr>
+                <w:rFonts w:ascii="Arial" w:eastAsia="Cascadia Mono" w:hAnsi="Arial" w:cs="Arial"/>
+                <w:sz w:val="14"/>
+                <w:szCs w:val="14"/>
+              </w:rPr>
+              <w:t xml:space="preserve"> Mistrials</w:t>
+            </w:r>
+          </w:p>
         </w:tc>
         <w:tc>
           <w:tcPr>
@@ -2968,7 +3229,6 @@
                 <w:color w:val="000000" w:themeColor="text1"/>
                 <w:sz w:val="16"/>
                 <w:szCs w:val="16"/>
-                <w:highlight w:val="yellow"/>
               </w:rPr>
             </w:pPr>
             <w:r>
@@ -2979,6 +3239,45 @@
                 <w:szCs w:val="16"/>
               </w:rPr>
               <w:t>Plcnum7</w:t>
+            </w:r>
+          </w:p>
+          <w:p>
+            <w:pPr>
+              <w:jc w:val="center"/>
+              <w:rPr>
+                <w:rFonts w:ascii="Arial" w:hAnsi="Arial" w:cs="Arial"/>
+                <w:color w:val="000000" w:themeColor="text1"/>
+                <w:sz w:val="16"/>
+                <w:szCs w:val="16"/>
+              </w:rPr>
+            </w:pPr>
+          </w:p>
+          <w:p>
+            <w:pPr>
+              <w:jc w:val="center"/>
+              <w:rPr>
+                <w:rFonts w:ascii="Arial" w:hAnsi="Arial" w:cs="Arial"/>
+                <w:sz w:val="14"/>
+                <w:szCs w:val="14"/>
+                <w:lang w:val="en-GB"/>
+              </w:rPr>
+            </w:pPr>
+            <w:r>
+              <w:rPr>
+                <w:rFonts w:ascii="Arial" w:eastAsia="Cascadia Mono" w:hAnsi="Arial" w:cs="Arial"/>
+                <w:sz w:val="14"/>
+                <w:szCs w:val="14"/>
+                <w:highlight w:val="white"/>
+              </w:rPr>
+              <w:t>Plcmis7</w:t>
+            </w:r>
+            <w:r>
+              <w:rPr>
+                <w:rFonts w:ascii="Arial" w:eastAsia="Cascadia Mono" w:hAnsi="Arial" w:cs="Arial"/>
+                <w:sz w:val="14"/>
+                <w:szCs w:val="14"/>
+              </w:rPr>
+              <w:t xml:space="preserve"> Mistrials</w:t>
             </w:r>
           </w:p>
         </w:tc>
@@ -3177,6 +3476,7 @@
                 <w:lang w:val="en-IN"/>
               </w:rPr>
             </w:pPr>
+            <w:proofErr w:type="spellStart"/>
             <w:r>
               <w:rPr>
                 <w:rFonts w:ascii="Arial" w:hAnsi="Arial" w:cs="Arial"/>
@@ -3187,6 +3487,7 @@
               </w:rPr>
               <w:t>PlcMajor</w:t>
             </w:r>
+            <w:proofErr w:type="spellEnd"/>
           </w:p>
         </w:tc>
       </w:tr>
@@ -3247,6 +3548,7 @@
                 <w:lang w:val="en-IN"/>
               </w:rPr>
             </w:pPr>
+            <w:proofErr w:type="spellStart"/>
             <w:r>
               <w:rPr>
                 <w:rFonts w:ascii="Arial" w:hAnsi="Arial" w:cs="Arial"/>
@@ -3257,6 +3559,7 @@
               </w:rPr>
               <w:t>PlcMinor</w:t>
             </w:r>
+            <w:proofErr w:type="spellEnd"/>
           </w:p>
         </w:tc>
       </w:tr>
@@ -3317,6 +3620,7 @@
                 <w:lang w:val="en-IN"/>
               </w:rPr>
             </w:pPr>
+            <w:proofErr w:type="spellStart"/>
             <w:r>
               <w:rPr>
                 <w:rFonts w:ascii="Arial" w:hAnsi="Arial" w:cs="Arial"/>
@@ -3327,6 +3631,7 @@
               </w:rPr>
               <w:t>PlcArrow</w:t>
             </w:r>
+            <w:proofErr w:type="spellEnd"/>
           </w:p>
         </w:tc>
       </w:tr>
@@ -3417,6 +3722,7 @@
                 <w:szCs w:val="16"/>
               </w:rPr>
             </w:pPr>
+            <w:proofErr w:type="spellStart"/>
             <w:r>
               <w:rPr>
                 <w:rFonts w:ascii="Consolas" w:eastAsia="Consolas" w:hAnsi="Consolas" w:cs="Consolas"/>
@@ -3427,6 +3733,7 @@
               </w:rPr>
               <w:t>PlcFeedBackP</w:t>
             </w:r>
+            <w:proofErr w:type="spellEnd"/>
           </w:p>
           <w:p>
             <w:pPr>
@@ -3476,7 +3783,17 @@
                 <w:sz w:val="16"/>
                 <w:szCs w:val="16"/>
               </w:rPr>
-              <w:t>Staff initials (initial after reading):</w:t>
+              <w:t xml:space="preserve">Staff initials </w:t>
+            </w:r>
+            <w:r>
+              <w:rPr>
+                <w:rFonts w:ascii="Arial" w:hAnsi="Arial" w:cs="Arial"/>
+                <w:b/>
+                <w:color w:val="000000" w:themeColor="text1"/>
+                <w:sz w:val="16"/>
+                <w:szCs w:val="16"/>
+              </w:rPr>
+              <w:t>(initial after reading):</w:t>
             </w:r>
           </w:p>
         </w:tc>
@@ -3564,6 +3881,7 @@
                 <w:shd w:val="clear" w:color="auto" w:fill="FFFFFF"/>
               </w:rPr>
             </w:pPr>
+            <w:proofErr w:type="spellStart"/>
             <w:r>
               <w:rPr>
                 <w:rFonts w:ascii="Consolas" w:eastAsia="Consolas" w:hAnsi="Consolas" w:cs="Consolas"/>
@@ -3574,6 +3892,7 @@
               </w:rPr>
               <w:t>PlcFeedBackC</w:t>
             </w:r>
+            <w:proofErr w:type="spellEnd"/>
           </w:p>
           <w:p>
             <w:pPr>
@@ -3677,9 +3996,9 @@
       </w:pPr>
     </w:p>
     <w:sectPr>
-      <w:footerReference w:type="even" r:id="rId8"/>
-      <w:footerReference w:type="default" r:id="rId9"/>
-      <w:footerReference w:type="first" r:id="rId10"/>
+      <w:footerReference w:type="even" r:id="rId9"/>
+      <w:footerReference w:type="default" r:id="rId10"/>
+      <w:footerReference w:type="first" r:id="rId11"/>
       <w:pgSz w:w="11906" w:h="16838"/>
       <w:pgMar w:top="432" w:right="720" w:bottom="720" w:left="446" w:header="0" w:footer="576" w:gutter="0"/>
       <w:cols w:space="720"/>
@@ -3691,7 +4010,7 @@
 </file>
 
 <file path=word/endnotes.xml><?xml version="1.0" encoding="utf-8"?>
-<w:endnotes xmlns:wpc="http://schemas.microsoft.com/office/word/2010/wordprocessingCanvas" xmlns:mc="http://schemas.openxmlformats.org/markup-compatibility/2006" xmlns:o="urn:schemas-microsoft-com:office:office" xmlns:r="http://schemas.openxmlformats.org/officeDocument/2006/relationships" xmlns:m="http://schemas.openxmlformats.org/officeDocument/2006/math" xmlns:v="urn:schemas-microsoft-com:vml" xmlns:wp14="http://schemas.microsoft.com/office/word/2010/wordprocessingDrawing" xmlns:wp="http://schemas.openxmlformats.org/drawingml/2006/wordprocessingDrawing" xmlns:w10="urn:schemas-microsoft-com:office:word" xmlns:w="http://schemas.openxmlformats.org/wordprocessingml/2006/main" xmlns:w14="http://schemas.microsoft.com/office/word/2010/wordml" xmlns:w15="http://schemas.microsoft.com/office/word/2012/wordml" xmlns:wpg="http://schemas.microsoft.com/office/word/2010/wordprocessingGroup" xmlns:wpi="http://schemas.microsoft.com/office/word/2010/wordprocessingInk" xmlns:wne="http://schemas.microsoft.com/office/word/2006/wordml" xmlns:wps="http://schemas.microsoft.com/office/word/2010/wordprocessingShape" mc:Ignorable="w14 w15 wp14">
+<w:endnotes xmlns:wpc="http://schemas.microsoft.com/office/word/2010/wordprocessingCanvas" xmlns:mc="http://schemas.openxmlformats.org/markup-compatibility/2006" xmlns:o="urn:schemas-microsoft-com:office:office" xmlns:r="http://schemas.openxmlformats.org/officeDocument/2006/relationships" xmlns:m="http://schemas.openxmlformats.org/officeDocument/2006/math" xmlns:v="urn:schemas-microsoft-com:vml" xmlns:wp14="http://schemas.microsoft.com/office/word/2010/wordprocessingDrawing" xmlns:wp="http://schemas.openxmlformats.org/drawingml/2006/wordprocessingDrawing" xmlns:w10="urn:schemas-microsoft-com:office:word" xmlns:w="http://schemas.openxmlformats.org/wordprocessingml/2006/main" xmlns:w14="http://schemas.microsoft.com/office/word/2010/wordml" xmlns:wpg="http://schemas.microsoft.com/office/word/2010/wordprocessingGroup" xmlns:wpi="http://schemas.microsoft.com/office/word/2010/wordprocessingInk" xmlns:wne="http://schemas.microsoft.com/office/word/2006/wordml" xmlns:wps="http://schemas.microsoft.com/office/word/2010/wordprocessingShape" mc:Ignorable="w14 wp14">
   <w:endnote w:type="separator" w:id="-1">
     <w:p>
       <w:r>
@@ -3710,7 +4029,7 @@
 </file>
 
 <file path=word/footer1.xml><?xml version="1.0" encoding="utf-8"?>
-<w:ftr xmlns:wpc="http://schemas.microsoft.com/office/word/2010/wordprocessingCanvas" xmlns:mc="http://schemas.openxmlformats.org/markup-compatibility/2006" xmlns:o="urn:schemas-microsoft-com:office:office" xmlns:r="http://schemas.openxmlformats.org/officeDocument/2006/relationships" xmlns:m="http://schemas.openxmlformats.org/officeDocument/2006/math" xmlns:v="urn:schemas-microsoft-com:vml" xmlns:wp14="http://schemas.microsoft.com/office/word/2010/wordprocessingDrawing" xmlns:wp="http://schemas.openxmlformats.org/drawingml/2006/wordprocessingDrawing" xmlns:w10="urn:schemas-microsoft-com:office:word" xmlns:w="http://schemas.openxmlformats.org/wordprocessingml/2006/main" xmlns:w14="http://schemas.microsoft.com/office/word/2010/wordml" xmlns:w15="http://schemas.microsoft.com/office/word/2012/wordml" xmlns:wpg="http://schemas.microsoft.com/office/word/2010/wordprocessingGroup" xmlns:wpi="http://schemas.microsoft.com/office/word/2010/wordprocessingInk" xmlns:wne="http://schemas.microsoft.com/office/word/2006/wordml" xmlns:wps="http://schemas.microsoft.com/office/word/2010/wordprocessingShape" mc:Ignorable="w14 w15 wp14">
+<w:ftr xmlns:wpc="http://schemas.microsoft.com/office/word/2010/wordprocessingCanvas" xmlns:mc="http://schemas.openxmlformats.org/markup-compatibility/2006" xmlns:o="urn:schemas-microsoft-com:office:office" xmlns:r="http://schemas.openxmlformats.org/officeDocument/2006/relationships" xmlns:m="http://schemas.openxmlformats.org/officeDocument/2006/math" xmlns:v="urn:schemas-microsoft-com:vml" xmlns:wp14="http://schemas.microsoft.com/office/word/2010/wordprocessingDrawing" xmlns:wp="http://schemas.openxmlformats.org/drawingml/2006/wordprocessingDrawing" xmlns:w10="urn:schemas-microsoft-com:office:word" xmlns:w="http://schemas.openxmlformats.org/wordprocessingml/2006/main" xmlns:w14="http://schemas.microsoft.com/office/word/2010/wordml" xmlns:wpg="http://schemas.microsoft.com/office/word/2010/wordprocessingGroup" xmlns:wpi="http://schemas.microsoft.com/office/word/2010/wordprocessingInk" xmlns:wne="http://schemas.microsoft.com/office/word/2006/wordml" xmlns:wps="http://schemas.microsoft.com/office/word/2010/wordprocessingShape" mc:Ignorable="w14 wp14">
   <w:p>
     <w:pPr>
       <w:pStyle w:val="Footer"/>
@@ -3720,7 +4039,7 @@
 </file>
 
 <file path=word/footer2.xml><?xml version="1.0" encoding="utf-8"?>
-<w:ftr xmlns:wpc="http://schemas.microsoft.com/office/word/2010/wordprocessingCanvas" xmlns:mc="http://schemas.openxmlformats.org/markup-compatibility/2006" xmlns:o="urn:schemas-microsoft-com:office:office" xmlns:r="http://schemas.openxmlformats.org/officeDocument/2006/relationships" xmlns:m="http://schemas.openxmlformats.org/officeDocument/2006/math" xmlns:v="urn:schemas-microsoft-com:vml" xmlns:wp14="http://schemas.microsoft.com/office/word/2010/wordprocessingDrawing" xmlns:wp="http://schemas.openxmlformats.org/drawingml/2006/wordprocessingDrawing" xmlns:w10="urn:schemas-microsoft-com:office:word" xmlns:w="http://schemas.openxmlformats.org/wordprocessingml/2006/main" xmlns:w14="http://schemas.microsoft.com/office/word/2010/wordml" xmlns:w15="http://schemas.microsoft.com/office/word/2012/wordml" xmlns:wpg="http://schemas.microsoft.com/office/word/2010/wordprocessingGroup" xmlns:wpi="http://schemas.microsoft.com/office/word/2010/wordprocessingInk" xmlns:wne="http://schemas.microsoft.com/office/word/2006/wordml" xmlns:wps="http://schemas.microsoft.com/office/word/2010/wordprocessingShape" mc:Ignorable="w14 w15 wp14">
+<w:ftr xmlns:wpc="http://schemas.microsoft.com/office/word/2010/wordprocessingCanvas" xmlns:mc="http://schemas.openxmlformats.org/markup-compatibility/2006" xmlns:o="urn:schemas-microsoft-com:office:office" xmlns:r="http://schemas.openxmlformats.org/officeDocument/2006/relationships" xmlns:m="http://schemas.openxmlformats.org/officeDocument/2006/math" xmlns:v="urn:schemas-microsoft-com:vml" xmlns:wp14="http://schemas.microsoft.com/office/word/2010/wordprocessingDrawing" xmlns:wp="http://schemas.openxmlformats.org/drawingml/2006/wordprocessingDrawing" xmlns:w10="urn:schemas-microsoft-com:office:word" xmlns:w="http://schemas.openxmlformats.org/wordprocessingml/2006/main" xmlns:w14="http://schemas.microsoft.com/office/word/2010/wordml" xmlns:wpg="http://schemas.microsoft.com/office/word/2010/wordprocessingGroup" xmlns:wpi="http://schemas.microsoft.com/office/word/2010/wordprocessingInk" xmlns:wne="http://schemas.microsoft.com/office/word/2006/wordml" xmlns:wps="http://schemas.microsoft.com/office/word/2010/wordprocessingShape" mc:Ignorable="w14 wp14">
   <w:p>
     <w:pPr>
       <w:pStyle w:val="Footer"/>
@@ -3795,7 +4114,7 @@
         <w:noProof/>
         <w:sz w:val="16"/>
       </w:rPr>
-      <w:t>25/02/26</w:t>
+      <w:t>09/03/26</w:t>
     </w:r>
     <w:r>
       <w:rPr>
@@ -3808,7 +4127,7 @@
 </file>
 
 <file path=word/footer3.xml><?xml version="1.0" encoding="utf-8"?>
-<w:ftr xmlns:wpc="http://schemas.microsoft.com/office/word/2010/wordprocessingCanvas" xmlns:mc="http://schemas.openxmlformats.org/markup-compatibility/2006" xmlns:o="urn:schemas-microsoft-com:office:office" xmlns:r="http://schemas.openxmlformats.org/officeDocument/2006/relationships" xmlns:m="http://schemas.openxmlformats.org/officeDocument/2006/math" xmlns:v="urn:schemas-microsoft-com:vml" xmlns:wp14="http://schemas.microsoft.com/office/word/2010/wordprocessingDrawing" xmlns:wp="http://schemas.openxmlformats.org/drawingml/2006/wordprocessingDrawing" xmlns:w10="urn:schemas-microsoft-com:office:word" xmlns:w="http://schemas.openxmlformats.org/wordprocessingml/2006/main" xmlns:w14="http://schemas.microsoft.com/office/word/2010/wordml" xmlns:w15="http://schemas.microsoft.com/office/word/2012/wordml" xmlns:wpg="http://schemas.microsoft.com/office/word/2010/wordprocessingGroup" xmlns:wpi="http://schemas.microsoft.com/office/word/2010/wordprocessingInk" xmlns:wne="http://schemas.microsoft.com/office/word/2006/wordml" xmlns:wps="http://schemas.microsoft.com/office/word/2010/wordprocessingShape" mc:Ignorable="w14 w15 wp14">
+<w:ftr xmlns:wpc="http://schemas.microsoft.com/office/word/2010/wordprocessingCanvas" xmlns:mc="http://schemas.openxmlformats.org/markup-compatibility/2006" xmlns:o="urn:schemas-microsoft-com:office:office" xmlns:r="http://schemas.openxmlformats.org/officeDocument/2006/relationships" xmlns:m="http://schemas.openxmlformats.org/officeDocument/2006/math" xmlns:v="urn:schemas-microsoft-com:vml" xmlns:wp14="http://schemas.microsoft.com/office/word/2010/wordprocessingDrawing" xmlns:wp="http://schemas.openxmlformats.org/drawingml/2006/wordprocessingDrawing" xmlns:w10="urn:schemas-microsoft-com:office:word" xmlns:w="http://schemas.openxmlformats.org/wordprocessingml/2006/main" xmlns:w14="http://schemas.microsoft.com/office/word/2010/wordml" xmlns:wpg="http://schemas.microsoft.com/office/word/2010/wordprocessingGroup" xmlns:wpi="http://schemas.microsoft.com/office/word/2010/wordprocessingInk" xmlns:wne="http://schemas.microsoft.com/office/word/2006/wordml" xmlns:wps="http://schemas.microsoft.com/office/word/2010/wordprocessingShape" mc:Ignorable="w14 wp14">
   <w:p>
     <w:pPr>
       <w:pStyle w:val="Footer"/>
@@ -3882,7 +4201,7 @@
         <w:noProof/>
         <w:sz w:val="16"/>
       </w:rPr>
-      <w:t>25/02/26</w:t>
+      <w:t>09/03/26</w:t>
     </w:r>
     <w:r>
       <w:rPr>
@@ -3895,7 +4214,7 @@
 </file>
 
 <file path=word/footnotes.xml><?xml version="1.0" encoding="utf-8"?>
-<w:footnotes xmlns:wpc="http://schemas.microsoft.com/office/word/2010/wordprocessingCanvas" xmlns:mc="http://schemas.openxmlformats.org/markup-compatibility/2006" xmlns:o="urn:schemas-microsoft-com:office:office" xmlns:r="http://schemas.openxmlformats.org/officeDocument/2006/relationships" xmlns:m="http://schemas.openxmlformats.org/officeDocument/2006/math" xmlns:v="urn:schemas-microsoft-com:vml" xmlns:wp14="http://schemas.microsoft.com/office/word/2010/wordprocessingDrawing" xmlns:wp="http://schemas.openxmlformats.org/drawingml/2006/wordprocessingDrawing" xmlns:w10="urn:schemas-microsoft-com:office:word" xmlns:w="http://schemas.openxmlformats.org/wordprocessingml/2006/main" xmlns:w14="http://schemas.microsoft.com/office/word/2010/wordml" xmlns:w15="http://schemas.microsoft.com/office/word/2012/wordml" xmlns:wpg="http://schemas.microsoft.com/office/word/2010/wordprocessingGroup" xmlns:wpi="http://schemas.microsoft.com/office/word/2010/wordprocessingInk" xmlns:wne="http://schemas.microsoft.com/office/word/2006/wordml" xmlns:wps="http://schemas.microsoft.com/office/word/2010/wordprocessingShape" mc:Ignorable="w14 w15 wp14">
+<w:footnotes xmlns:wpc="http://schemas.microsoft.com/office/word/2010/wordprocessingCanvas" xmlns:mc="http://schemas.openxmlformats.org/markup-compatibility/2006" xmlns:o="urn:schemas-microsoft-com:office:office" xmlns:r="http://schemas.openxmlformats.org/officeDocument/2006/relationships" xmlns:m="http://schemas.openxmlformats.org/officeDocument/2006/math" xmlns:v="urn:schemas-microsoft-com:vml" xmlns:wp14="http://schemas.microsoft.com/office/word/2010/wordprocessingDrawing" xmlns:wp="http://schemas.openxmlformats.org/drawingml/2006/wordprocessingDrawing" xmlns:w10="urn:schemas-microsoft-com:office:word" xmlns:w="http://schemas.openxmlformats.org/wordprocessingml/2006/main" xmlns:w14="http://schemas.microsoft.com/office/word/2010/wordml" xmlns:wpg="http://schemas.microsoft.com/office/word/2010/wordprocessingGroup" xmlns:wpi="http://schemas.microsoft.com/office/word/2010/wordprocessingInk" xmlns:wne="http://schemas.microsoft.com/office/word/2006/wordml" xmlns:wps="http://schemas.microsoft.com/office/word/2010/wordprocessingShape" mc:Ignorable="w14 wp14">
   <w:footnote w:type="separator" w:id="-1">
     <w:p>
       <w:r>
@@ -3914,395 +4233,175 @@
 </file>
 
 <file path=word/styles.xml><?xml version="1.0" encoding="utf-8"?>
-<w:styles xmlns:mc="http://schemas.openxmlformats.org/markup-compatibility/2006" xmlns:r="http://schemas.openxmlformats.org/officeDocument/2006/relationships" xmlns:w="http://schemas.openxmlformats.org/wordprocessingml/2006/main" xmlns:w14="http://schemas.microsoft.com/office/word/2010/wordml" xmlns:w15="http://schemas.microsoft.com/office/word/2012/wordml" mc:Ignorable="w14 w15">
+<w:styles xmlns:mc="http://schemas.openxmlformats.org/markup-compatibility/2006" xmlns:r="http://schemas.openxmlformats.org/officeDocument/2006/relationships" xmlns:w="http://schemas.openxmlformats.org/wordprocessingml/2006/main" xmlns:w14="http://schemas.microsoft.com/office/word/2010/wordml" mc:Ignorable="w14">
   <w:docDefaults>
     <w:rPrDefault>
       <w:rPr>
         <w:rFonts w:ascii="Times New Roman" w:eastAsia="SimSun" w:hAnsi="Times New Roman" w:cs="Times New Roman"/>
-        <w:lang w:val="en-IN" w:eastAsia="zh-CN" w:bidi="hi-IN"/>
+        <w:lang w:val="en-US" w:eastAsia="en-US" w:bidi="ar-SA"/>
       </w:rPr>
     </w:rPrDefault>
-    <w:pPrDefault>
-      <w:pPr>
-        <w:suppressAutoHyphens/>
-      </w:pPr>
-    </w:pPrDefault>
+    <w:pPrDefault/>
   </w:docDefaults>
-  <w:latentStyles w:defLockedState="0" w:defUIPriority="0" w:defSemiHidden="0" w:defUnhideWhenUsed="0" w:defQFormat="0" w:count="371">
-    <w:lsdException w:name="Normal" w:qFormat="1"/>
-    <w:lsdException w:name="heading 1" w:qFormat="1"/>
-    <w:lsdException w:name="heading 2" w:semiHidden="1" w:unhideWhenUsed="1" w:qFormat="1"/>
-    <w:lsdException w:name="heading 3" w:semiHidden="1" w:unhideWhenUsed="1" w:qFormat="1"/>
-    <w:lsdException w:name="heading 4" w:semiHidden="1" w:unhideWhenUsed="1" w:qFormat="1"/>
-    <w:lsdException w:name="heading 5" w:semiHidden="1" w:unhideWhenUsed="1" w:qFormat="1"/>
-    <w:lsdException w:name="heading 6" w:semiHidden="1" w:unhideWhenUsed="1" w:qFormat="1"/>
-    <w:lsdException w:name="heading 7" w:semiHidden="1" w:unhideWhenUsed="1" w:qFormat="1"/>
-    <w:lsdException w:name="heading 8" w:semiHidden="1" w:unhideWhenUsed="1" w:qFormat="1"/>
-    <w:lsdException w:name="heading 9" w:semiHidden="1" w:unhideWhenUsed="1" w:qFormat="1"/>
-    <w:lsdException w:name="index 1" w:semiHidden="1" w:unhideWhenUsed="1"/>
-    <w:lsdException w:name="index 2" w:semiHidden="1" w:unhideWhenUsed="1"/>
-    <w:lsdException w:name="index 3" w:semiHidden="1" w:unhideWhenUsed="1"/>
-    <w:lsdException w:name="index 4" w:semiHidden="1" w:unhideWhenUsed="1"/>
-    <w:lsdException w:name="index 5" w:semiHidden="1" w:unhideWhenUsed="1"/>
-    <w:lsdException w:name="index 6" w:semiHidden="1" w:unhideWhenUsed="1"/>
-    <w:lsdException w:name="index 7" w:semiHidden="1" w:unhideWhenUsed="1"/>
-    <w:lsdException w:name="index 8" w:semiHidden="1" w:unhideWhenUsed="1"/>
-    <w:lsdException w:name="index 9" w:semiHidden="1" w:unhideWhenUsed="1"/>
-    <w:lsdException w:name="toc 1" w:semiHidden="1" w:unhideWhenUsed="1"/>
-    <w:lsdException w:name="toc 2" w:semiHidden="1" w:unhideWhenUsed="1"/>
-    <w:lsdException w:name="toc 3" w:semiHidden="1" w:unhideWhenUsed="1"/>
-    <w:lsdException w:name="toc 4" w:semiHidden="1" w:unhideWhenUsed="1"/>
-    <w:lsdException w:name="toc 5" w:semiHidden="1" w:unhideWhenUsed="1"/>
-    <w:lsdException w:name="toc 6" w:semiHidden="1" w:unhideWhenUsed="1"/>
-    <w:lsdException w:name="toc 7" w:semiHidden="1" w:unhideWhenUsed="1"/>
-    <w:lsdException w:name="toc 8" w:semiHidden="1" w:unhideWhenUsed="1"/>
-    <w:lsdException w:name="toc 9" w:semiHidden="1" w:unhideWhenUsed="1"/>
-    <w:lsdException w:name="Normal Indent" w:semiHidden="1" w:unhideWhenUsed="1"/>
-    <w:lsdException w:name="footnote text" w:semiHidden="1" w:unhideWhenUsed="1"/>
-    <w:lsdException w:name="annotation text" w:semiHidden="1" w:unhideWhenUsed="1"/>
-    <w:lsdException w:name="header" w:qFormat="1"/>
-    <w:lsdException w:name="footer" w:qFormat="1"/>
-    <w:lsdException w:name="index heading" w:semiHidden="1" w:unhideWhenUsed="1"/>
-    <w:lsdException w:name="caption" w:semiHidden="1" w:unhideWhenUsed="1" w:qFormat="1"/>
-    <w:lsdException w:name="table of figures" w:semiHidden="1" w:unhideWhenUsed="1"/>
-    <w:lsdException w:name="envelope address" w:semiHidden="1" w:unhideWhenUsed="1"/>
-    <w:lsdException w:name="envelope return" w:semiHidden="1" w:unhideWhenUsed="1"/>
-    <w:lsdException w:name="footnote reference" w:semiHidden="1" w:unhideWhenUsed="1"/>
-    <w:lsdException w:name="annotation reference" w:semiHidden="1" w:unhideWhenUsed="1"/>
-    <w:lsdException w:name="line number" w:semiHidden="1" w:unhideWhenUsed="1"/>
-    <w:lsdException w:name="page number" w:semiHidden="1" w:unhideWhenUsed="1"/>
-    <w:lsdException w:name="endnote reference" w:semiHidden="1" w:unhideWhenUsed="1"/>
-    <w:lsdException w:name="endnote text" w:semiHidden="1" w:unhideWhenUsed="1"/>
-    <w:lsdException w:name="table of authorities" w:semiHidden="1" w:unhideWhenUsed="1"/>
-    <w:lsdException w:name="macro" w:semiHidden="1" w:unhideWhenUsed="1"/>
-    <w:lsdException w:name="toa heading" w:semiHidden="1" w:unhideWhenUsed="1"/>
-    <w:lsdException w:name="List" w:semiHidden="1" w:unhideWhenUsed="1"/>
-    <w:lsdException w:name="List Bullet" w:semiHidden="1" w:unhideWhenUsed="1"/>
-    <w:lsdException w:name="List 2" w:semiHidden="1" w:unhideWhenUsed="1"/>
-    <w:lsdException w:name="List 3" w:semiHidden="1" w:unhideWhenUsed="1"/>
-    <w:lsdException w:name="List Bullet 2" w:semiHidden="1" w:unhideWhenUsed="1"/>
-    <w:lsdException w:name="List Bullet 3" w:semiHidden="1" w:unhideWhenUsed="1"/>
-    <w:lsdException w:name="List Bullet 4" w:semiHidden="1" w:unhideWhenUsed="1"/>
-    <w:lsdException w:name="List Bullet 5" w:semiHidden="1" w:unhideWhenUsed="1"/>
-    <w:lsdException w:name="List Number 2" w:semiHidden="1" w:unhideWhenUsed="1"/>
-    <w:lsdException w:name="List Number 3" w:semiHidden="1" w:unhideWhenUsed="1"/>
-    <w:lsdException w:name="List Number 4" w:semiHidden="1" w:unhideWhenUsed="1"/>
-    <w:lsdException w:name="List Number 5" w:semiHidden="1" w:unhideWhenUsed="1"/>
-    <w:lsdException w:name="Title" w:qFormat="1"/>
-    <w:lsdException w:name="Closing" w:semiHidden="1" w:unhideWhenUsed="1"/>
-    <w:lsdException w:name="Signature" w:semiHidden="1" w:unhideWhenUsed="1"/>
-    <w:lsdException w:name="Default Paragraph Font" w:semiHidden="1" w:uiPriority="1" w:unhideWhenUsed="1" w:qFormat="1"/>
-    <w:lsdException w:name="Body Text" w:semiHidden="1" w:unhideWhenUsed="1"/>
-    <w:lsdException w:name="Body Text Indent" w:semiHidden="1" w:unhideWhenUsed="1"/>
-    <w:lsdException w:name="List Continue" w:semiHidden="1" w:unhideWhenUsed="1"/>
-    <w:lsdException w:name="List Continue 2" w:semiHidden="1" w:unhideWhenUsed="1"/>
-    <w:lsdException w:name="List Continue 3" w:semiHidden="1" w:unhideWhenUsed="1"/>
-    <w:lsdException w:name="List Continue 4" w:semiHidden="1" w:unhideWhenUsed="1"/>
-    <w:lsdException w:name="List Continue 5" w:semiHidden="1" w:unhideWhenUsed="1"/>
-    <w:lsdException w:name="Message Header" w:semiHidden="1" w:unhideWhenUsed="1"/>
-    <w:lsdException w:name="Subtitle" w:qFormat="1"/>
-    <w:lsdException w:name="Body Text First Indent 2" w:semiHidden="1" w:unhideWhenUsed="1"/>
-    <w:lsdException w:name="Note Heading" w:semiHidden="1" w:unhideWhenUsed="1"/>
-    <w:lsdException w:name="Body Text 2" w:semiHidden="1" w:unhideWhenUsed="1"/>
-    <w:lsdException w:name="Body Text 3" w:semiHidden="1" w:unhideWhenUsed="1"/>
-    <w:lsdException w:name="Body Text Indent 2" w:semiHidden="1" w:unhideWhenUsed="1"/>
-    <w:lsdException w:name="Body Text Indent 3" w:semiHidden="1" w:unhideWhenUsed="1"/>
-    <w:lsdException w:name="Block Text" w:semiHidden="1" w:unhideWhenUsed="1"/>
-    <w:lsdException w:name="Hyperlink" w:semiHidden="1" w:unhideWhenUsed="1"/>
-    <w:lsdException w:name="FollowedHyperlink" w:semiHidden="1" w:unhideWhenUsed="1"/>
-    <w:lsdException w:name="Strong" w:qFormat="1"/>
-    <w:lsdException w:name="Emphasis" w:qFormat="1"/>
-    <w:lsdException w:name="Document Map" w:semiHidden="1" w:unhideWhenUsed="1"/>
-    <w:lsdException w:name="Plain Text" w:semiHidden="1" w:unhideWhenUsed="1"/>
-    <w:lsdException w:name="E-mail Signature" w:semiHidden="1" w:unhideWhenUsed="1"/>
-    <w:lsdException w:name="HTML Top of Form" w:semiHidden="1" w:uiPriority="99" w:unhideWhenUsed="1"/>
-    <w:lsdException w:name="HTML Bottom of Form" w:semiHidden="1" w:uiPriority="99" w:unhideWhenUsed="1"/>
-    <w:lsdException w:name="Normal (Web)" w:semiHidden="1" w:unhideWhenUsed="1"/>
-    <w:lsdException w:name="HTML Acronym" w:semiHidden="1" w:unhideWhenUsed="1"/>
-    <w:lsdException w:name="HTML Address" w:semiHidden="1" w:unhideWhenUsed="1"/>
-    <w:lsdException w:name="HTML Cite" w:semiHidden="1" w:unhideWhenUsed="1"/>
-    <w:lsdException w:name="HTML Code" w:semiHidden="1" w:unhideWhenUsed="1"/>
-    <w:lsdException w:name="HTML Definition" w:semiHidden="1" w:unhideWhenUsed="1"/>
-    <w:lsdException w:name="HTML Keyboard" w:semiHidden="1" w:unhideWhenUsed="1"/>
-    <w:lsdException w:name="HTML Preformatted" w:semiHidden="1" w:unhideWhenUsed="1" w:qFormat="1"/>
-    <w:lsdException w:name="HTML Sample" w:semiHidden="1" w:unhideWhenUsed="1"/>
-    <w:lsdException w:name="HTML Typewriter" w:semiHidden="1" w:unhideWhenUsed="1"/>
-    <w:lsdException w:name="HTML Variable" w:semiHidden="1" w:unhideWhenUsed="1"/>
-    <w:lsdException w:name="Normal Table" w:semiHidden="1" w:uiPriority="99" w:unhideWhenUsed="1" w:qFormat="1"/>
-    <w:lsdException w:name="annotation subject" w:semiHidden="1" w:unhideWhenUsed="1"/>
-    <w:lsdException w:name="No List" w:semiHidden="1" w:uiPriority="99" w:unhideWhenUsed="1"/>
-    <w:lsdException w:name="Outline List 1" w:semiHidden="1" w:uiPriority="99" w:unhideWhenUsed="1"/>
-    <w:lsdException w:name="Outline List 2" w:semiHidden="1" w:uiPriority="99" w:unhideWhenUsed="1"/>
-    <w:lsdException w:name="Outline List 3" w:semiHidden="1" w:uiPriority="99" w:unhideWhenUsed="1"/>
-    <w:lsdException w:name="Table Simple 1" w:semiHidden="1" w:unhideWhenUsed="1"/>
-    <w:lsdException w:name="Table Simple 2" w:semiHidden="1" w:unhideWhenUsed="1"/>
-    <w:lsdException w:name="Table Simple 3" w:semiHidden="1" w:unhideWhenUsed="1"/>
-    <w:lsdException w:name="Table Classic 1" w:semiHidden="1" w:unhideWhenUsed="1"/>
-    <w:lsdException w:name="Table Classic 2" w:semiHidden="1" w:unhideWhenUsed="1"/>
-    <w:lsdException w:name="Table Classic 3" w:semiHidden="1" w:unhideWhenUsed="1"/>
-    <w:lsdException w:name="Table Classic 4" w:semiHidden="1" w:unhideWhenUsed="1"/>
-    <w:lsdException w:name="Table Colorful 1" w:semiHidden="1" w:unhideWhenUsed="1"/>
-    <w:lsdException w:name="Table Colorful 2" w:semiHidden="1" w:unhideWhenUsed="1"/>
-    <w:lsdException w:name="Table Colorful 3" w:semiHidden="1" w:unhideWhenUsed="1"/>
-    <w:lsdException w:name="Table Columns 1" w:semiHidden="1" w:unhideWhenUsed="1"/>
-    <w:lsdException w:name="Table Columns 2" w:semiHidden="1" w:unhideWhenUsed="1"/>
-    <w:lsdException w:name="Table Columns 3" w:semiHidden="1" w:unhideWhenUsed="1"/>
-    <w:lsdException w:name="Table Columns 4" w:semiHidden="1" w:unhideWhenUsed="1"/>
-    <w:lsdException w:name="Table Columns 5" w:semiHidden="1" w:unhideWhenUsed="1"/>
-    <w:lsdException w:name="Table Grid 1" w:semiHidden="1" w:unhideWhenUsed="1"/>
-    <w:lsdException w:name="Table Grid 2" w:semiHidden="1" w:unhideWhenUsed="1"/>
-    <w:lsdException w:name="Table Grid 3" w:semiHidden="1" w:unhideWhenUsed="1"/>
-    <w:lsdException w:name="Table Grid 4" w:semiHidden="1" w:unhideWhenUsed="1"/>
-    <w:lsdException w:name="Table Grid 5" w:semiHidden="1" w:unhideWhenUsed="1"/>
-    <w:lsdException w:name="Table Grid 6" w:semiHidden="1" w:unhideWhenUsed="1"/>
-    <w:lsdException w:name="Table Grid 7" w:semiHidden="1" w:unhideWhenUsed="1"/>
-    <w:lsdException w:name="Table Grid 8" w:semiHidden="1" w:unhideWhenUsed="1"/>
-    <w:lsdException w:name="Table List 1" w:semiHidden="1" w:unhideWhenUsed="1"/>
-    <w:lsdException w:name="Table List 2" w:semiHidden="1" w:unhideWhenUsed="1"/>
-    <w:lsdException w:name="Table List 3" w:semiHidden="1" w:unhideWhenUsed="1"/>
-    <w:lsdException w:name="Table List 4" w:semiHidden="1" w:unhideWhenUsed="1"/>
-    <w:lsdException w:name="Table List 5" w:semiHidden="1" w:unhideWhenUsed="1"/>
-    <w:lsdException w:name="Table List 6" w:semiHidden="1" w:unhideWhenUsed="1"/>
-    <w:lsdException w:name="Table List 7" w:semiHidden="1" w:unhideWhenUsed="1"/>
-    <w:lsdException w:name="Table List 8" w:semiHidden="1" w:unhideWhenUsed="1"/>
-    <w:lsdException w:name="Table 3D effects 1" w:semiHidden="1" w:unhideWhenUsed="1"/>
-    <w:lsdException w:name="Table 3D effects 2" w:semiHidden="1" w:unhideWhenUsed="1"/>
-    <w:lsdException w:name="Table 3D effects 3" w:semiHidden="1" w:unhideWhenUsed="1"/>
-    <w:lsdException w:name="Table Contemporary" w:semiHidden="1" w:unhideWhenUsed="1"/>
-    <w:lsdException w:name="Table Elegant" w:semiHidden="1" w:unhideWhenUsed="1"/>
-    <w:lsdException w:name="Table Professional" w:semiHidden="1" w:unhideWhenUsed="1"/>
-    <w:lsdException w:name="Table Subtle 1" w:semiHidden="1" w:unhideWhenUsed="1"/>
-    <w:lsdException w:name="Table Subtle 2" w:semiHidden="1" w:unhideWhenUsed="1"/>
-    <w:lsdException w:name="Table Web 1" w:semiHidden="1" w:unhideWhenUsed="1"/>
-    <w:lsdException w:name="Table Web 2" w:semiHidden="1" w:unhideWhenUsed="1"/>
-    <w:lsdException w:name="Table Web 3" w:semiHidden="1" w:unhideWhenUsed="1"/>
-    <w:lsdException w:name="Balloon Text" w:semiHidden="1" w:qFormat="1"/>
-    <w:lsdException w:name="Table Grid" w:qFormat="1"/>
-    <w:lsdException w:name="Table Theme" w:semiHidden="1" w:unhideWhenUsed="1"/>
-    <w:lsdException w:name="Placeholder Text" w:semiHidden="1" w:uiPriority="99"/>
+  <w:latentStyles w:defLockedState="0" w:defUIPriority="0" w:defSemiHidden="1" w:defUnhideWhenUsed="1" w:defQFormat="0" w:count="267">
+    <w:lsdException w:name="Normal" w:semiHidden="0" w:unhideWhenUsed="0" w:qFormat="1"/>
+    <w:lsdException w:name="heading 1" w:semiHidden="0" w:unhideWhenUsed="0" w:qFormat="1"/>
+    <w:lsdException w:name="heading 2" w:qFormat="1"/>
+    <w:lsdException w:name="heading 3" w:qFormat="1"/>
+    <w:lsdException w:name="heading 4" w:qFormat="1"/>
+    <w:lsdException w:name="heading 5" w:qFormat="1"/>
+    <w:lsdException w:name="heading 6" w:qFormat="1"/>
+    <w:lsdException w:name="heading 7" w:qFormat="1"/>
+    <w:lsdException w:name="heading 8" w:qFormat="1"/>
+    <w:lsdException w:name="heading 9" w:qFormat="1"/>
+    <w:lsdException w:name="header" w:semiHidden="0" w:unhideWhenUsed="0" w:qFormat="1"/>
+    <w:lsdException w:name="footer" w:semiHidden="0" w:unhideWhenUsed="0" w:qFormat="1"/>
+    <w:lsdException w:name="caption" w:semiHidden="0" w:unhideWhenUsed="0" w:qFormat="1"/>
+    <w:lsdException w:name="List" w:semiHidden="0" w:unhideWhenUsed="0" w:qFormat="1"/>
+    <w:lsdException w:name="List Number" w:semiHidden="0" w:unhideWhenUsed="0"/>
+    <w:lsdException w:name="List 4" w:semiHidden="0" w:unhideWhenUsed="0"/>
+    <w:lsdException w:name="List 5" w:semiHidden="0" w:unhideWhenUsed="0"/>
+    <w:lsdException w:name="Title" w:semiHidden="0" w:unhideWhenUsed="0" w:qFormat="1"/>
+    <w:lsdException w:name="Default Paragraph Font" w:uiPriority="1" w:qFormat="1"/>
+    <w:lsdException w:name="Body Text" w:semiHidden="0" w:unhideWhenUsed="0" w:qFormat="1"/>
+    <w:lsdException w:name="Subtitle" w:semiHidden="0" w:unhideWhenUsed="0" w:qFormat="1"/>
+    <w:lsdException w:name="Salutation" w:semiHidden="0" w:unhideWhenUsed="0"/>
+    <w:lsdException w:name="Date" w:semiHidden="0" w:unhideWhenUsed="0"/>
+    <w:lsdException w:name="Body Text First Indent" w:semiHidden="0" w:unhideWhenUsed="0"/>
+    <w:lsdException w:name="Strong" w:semiHidden="0" w:unhideWhenUsed="0" w:qFormat="1"/>
+    <w:lsdException w:name="Emphasis" w:semiHidden="0" w:unhideWhenUsed="0" w:qFormat="1"/>
+    <w:lsdException w:name="HTML Top of Form" w:uiPriority="99"/>
+    <w:lsdException w:name="HTML Bottom of Form" w:uiPriority="99"/>
+    <w:lsdException w:name="HTML Preformatted" w:qFormat="1"/>
+    <w:lsdException w:name="Normal Table" w:uiPriority="99"/>
+    <w:lsdException w:name="No List" w:uiPriority="99"/>
+    <w:lsdException w:name="Outline List 1" w:uiPriority="99"/>
+    <w:lsdException w:name="Outline List 2" w:uiPriority="99"/>
+    <w:lsdException w:name="Outline List 3" w:uiPriority="99"/>
+    <w:lsdException w:name="Balloon Text" w:unhideWhenUsed="0" w:qFormat="1"/>
+    <w:lsdException w:name="Table Grid" w:semiHidden="0" w:unhideWhenUsed="0" w:qFormat="1"/>
+    <w:lsdException w:name="Placeholder Text" w:uiPriority="99"/>
     <w:lsdException w:name="No Spacing" w:uiPriority="99"/>
-    <w:lsdException w:name="Light Shading" w:uiPriority="60"/>
-    <w:lsdException w:name="Light List" w:uiPriority="61"/>
-    <w:lsdException w:name="Light Grid" w:uiPriority="62"/>
-    <w:lsdException w:name="Medium Shading 1" w:uiPriority="63"/>
-    <w:lsdException w:name="Medium Shading 2" w:uiPriority="64"/>
-    <w:lsdException w:name="Medium List 1" w:uiPriority="65"/>
-    <w:lsdException w:name="Medium List 2" w:uiPriority="66"/>
-    <w:lsdException w:name="Medium Grid 1" w:uiPriority="67"/>
-    <w:lsdException w:name="Medium Grid 2" w:uiPriority="68"/>
-    <w:lsdException w:name="Medium Grid 3" w:uiPriority="69"/>
-    <w:lsdException w:name="Dark List" w:uiPriority="70"/>
-    <w:lsdException w:name="Colorful Shading" w:uiPriority="71"/>
-    <w:lsdException w:name="Colorful List" w:uiPriority="72"/>
-    <w:lsdException w:name="Colorful Grid" w:uiPriority="73"/>
-    <w:lsdException w:name="Light Shading Accent 1" w:uiPriority="60"/>
-    <w:lsdException w:name="Light List Accent 1" w:uiPriority="61"/>
-    <w:lsdException w:name="Light Grid Accent 1" w:uiPriority="62"/>
-    <w:lsdException w:name="Medium Shading 1 Accent 1" w:uiPriority="63"/>
-    <w:lsdException w:name="Medium Shading 2 Accent 1" w:uiPriority="64"/>
-    <w:lsdException w:name="Medium List 1 Accent 1" w:uiPriority="65"/>
-    <w:lsdException w:name="Revision" w:semiHidden="1" w:uiPriority="99"/>
-    <w:lsdException w:name="List Paragraph" w:uiPriority="99" w:qFormat="1"/>
+    <w:lsdException w:name="Light Shading" w:semiHidden="0" w:uiPriority="60" w:unhideWhenUsed="0"/>
+    <w:lsdException w:name="Light List" w:semiHidden="0" w:uiPriority="61" w:unhideWhenUsed="0"/>
+    <w:lsdException w:name="Light Grid" w:semiHidden="0" w:uiPriority="62" w:unhideWhenUsed="0"/>
+    <w:lsdException w:name="Medium Shading 1" w:semiHidden="0" w:uiPriority="63" w:unhideWhenUsed="0"/>
+    <w:lsdException w:name="Medium Shading 2" w:semiHidden="0" w:uiPriority="64" w:unhideWhenUsed="0"/>
+    <w:lsdException w:name="Medium List 1" w:semiHidden="0" w:uiPriority="65" w:unhideWhenUsed="0"/>
+    <w:lsdException w:name="Medium List 2" w:semiHidden="0" w:uiPriority="66" w:unhideWhenUsed="0"/>
+    <w:lsdException w:name="Medium Grid 1" w:semiHidden="0" w:uiPriority="67" w:unhideWhenUsed="0"/>
+    <w:lsdException w:name="Medium Grid 2" w:semiHidden="0" w:uiPriority="68" w:unhideWhenUsed="0"/>
+    <w:lsdException w:name="Medium Grid 3" w:semiHidden="0" w:uiPriority="69" w:unhideWhenUsed="0"/>
+    <w:lsdException w:name="Dark List" w:semiHidden="0" w:uiPriority="70" w:unhideWhenUsed="0"/>
+    <w:lsdException w:name="Colorful Shading" w:semiHidden="0" w:uiPriority="71" w:unhideWhenUsed="0"/>
+    <w:lsdException w:name="Colorful List" w:semiHidden="0" w:uiPriority="72" w:unhideWhenUsed="0"/>
+    <w:lsdException w:name="Colorful Grid" w:semiHidden="0" w:uiPriority="73" w:unhideWhenUsed="0"/>
+    <w:lsdException w:name="Light Shading Accent 1" w:semiHidden="0" w:uiPriority="60" w:unhideWhenUsed="0"/>
+    <w:lsdException w:name="Light List Accent 1" w:semiHidden="0" w:uiPriority="61" w:unhideWhenUsed="0"/>
+    <w:lsdException w:name="Light Grid Accent 1" w:semiHidden="0" w:uiPriority="62" w:unhideWhenUsed="0"/>
+    <w:lsdException w:name="Medium Shading 1 Accent 1" w:semiHidden="0" w:uiPriority="63" w:unhideWhenUsed="0"/>
+    <w:lsdException w:name="Medium Shading 2 Accent 1" w:semiHidden="0" w:uiPriority="64" w:unhideWhenUsed="0"/>
+    <w:lsdException w:name="Medium List 1 Accent 1" w:semiHidden="0" w:uiPriority="65" w:unhideWhenUsed="0"/>
+    <w:lsdException w:name="Revision" w:uiPriority="99"/>
+    <w:lsdException w:name="List Paragraph" w:semiHidden="0" w:uiPriority="99" w:unhideWhenUsed="0" w:qFormat="1"/>
     <w:lsdException w:name="Quote" w:uiPriority="99"/>
     <w:lsdException w:name="Intense Quote" w:uiPriority="99"/>
-    <w:lsdException w:name="Medium List 2 Accent 1" w:uiPriority="66"/>
-    <w:lsdException w:name="Medium Grid 1 Accent 1" w:uiPriority="67"/>
-    <w:lsdException w:name="Medium Grid 2 Accent 1" w:uiPriority="68"/>
-    <w:lsdException w:name="Medium Grid 3 Accent 1" w:uiPriority="69"/>
-    <w:lsdException w:name="Dark List Accent 1" w:uiPriority="70"/>
-    <w:lsdException w:name="Colorful Shading Accent 1" w:uiPriority="71"/>
-    <w:lsdException w:name="Colorful List Accent 1" w:uiPriority="72"/>
-    <w:lsdException w:name="Colorful Grid Accent 1" w:uiPriority="73"/>
-    <w:lsdException w:name="Light Shading Accent 2" w:uiPriority="60"/>
-    <w:lsdException w:name="Light List Accent 2" w:uiPriority="61"/>
-    <w:lsdException w:name="Light Grid Accent 2" w:uiPriority="62"/>
-    <w:lsdException w:name="Medium Shading 1 Accent 2" w:uiPriority="63"/>
-    <w:lsdException w:name="Medium Shading 2 Accent 2" w:uiPriority="64"/>
-    <w:lsdException w:name="Medium List 1 Accent 2" w:uiPriority="65"/>
-    <w:lsdException w:name="Medium List 2 Accent 2" w:uiPriority="66"/>
-    <w:lsdException w:name="Medium Grid 1 Accent 2" w:uiPriority="67"/>
-    <w:lsdException w:name="Medium Grid 2 Accent 2" w:uiPriority="68"/>
-    <w:lsdException w:name="Medium Grid 3 Accent 2" w:uiPriority="69"/>
-    <w:lsdException w:name="Dark List Accent 2" w:uiPriority="70"/>
-    <w:lsdException w:name="Colorful Shading Accent 2" w:uiPriority="71"/>
-    <w:lsdException w:name="Colorful List Accent 2" w:uiPriority="72"/>
-    <w:lsdException w:name="Colorful Grid Accent 2" w:uiPriority="73"/>
-    <w:lsdException w:name="Light Shading Accent 3" w:uiPriority="60"/>
-    <w:lsdException w:name="Light List Accent 3" w:uiPriority="61"/>
-    <w:lsdException w:name="Light Grid Accent 3" w:uiPriority="62"/>
-    <w:lsdException w:name="Medium Shading 1 Accent 3" w:uiPriority="63"/>
-    <w:lsdException w:name="Medium Shading 2 Accent 3" w:uiPriority="64"/>
-    <w:lsdException w:name="Medium List 1 Accent 3" w:uiPriority="65"/>
-    <w:lsdException w:name="Medium List 2 Accent 3" w:uiPriority="66"/>
-    <w:lsdException w:name="Medium Grid 1 Accent 3" w:uiPriority="67"/>
-    <w:lsdException w:name="Medium Grid 2 Accent 3" w:uiPriority="68"/>
-    <w:lsdException w:name="Medium Grid 3 Accent 3" w:uiPriority="69"/>
-    <w:lsdException w:name="Dark List Accent 3" w:uiPriority="70"/>
-    <w:lsdException w:name="Colorful Shading Accent 3" w:uiPriority="71"/>
-    <w:lsdException w:name="Colorful List Accent 3" w:uiPriority="72"/>
-    <w:lsdException w:name="Colorful Grid Accent 3" w:uiPriority="73"/>
-    <w:lsdException w:name="Light Shading Accent 4" w:uiPriority="60"/>
-    <w:lsdException w:name="Light List Accent 4" w:uiPriority="61"/>
-    <w:lsdException w:name="Light Grid Accent 4" w:uiPriority="62"/>
-    <w:lsdException w:name="Medium Shading 1 Accent 4" w:uiPriority="63"/>
-    <w:lsdException w:name="Medium Shading 2 Accent 4" w:uiPriority="64"/>
-    <w:lsdException w:name="Medium List 1 Accent 4" w:uiPriority="65"/>
-    <w:lsdException w:name="Medium List 2 Accent 4" w:uiPriority="66"/>
-    <w:lsdException w:name="Medium Grid 1 Accent 4" w:uiPriority="67"/>
-    <w:lsdException w:name="Medium Grid 2 Accent 4" w:uiPriority="68"/>
-    <w:lsdException w:name="Medium Grid 3 Accent 4" w:uiPriority="69"/>
-    <w:lsdException w:name="Dark List Accent 4" w:uiPriority="70"/>
-    <w:lsdException w:name="Colorful Shading Accent 4" w:uiPriority="71"/>
-    <w:lsdException w:name="Colorful List Accent 4" w:uiPriority="72"/>
-    <w:lsdException w:name="Colorful Grid Accent 4" w:uiPriority="73"/>
-    <w:lsdException w:name="Light Shading Accent 5" w:uiPriority="60"/>
-    <w:lsdException w:name="Light List Accent 5" w:uiPriority="61"/>
-    <w:lsdException w:name="Light Grid Accent 5" w:uiPriority="62"/>
-    <w:lsdException w:name="Medium Shading 1 Accent 5" w:uiPriority="63"/>
-    <w:lsdException w:name="Medium Shading 2 Accent 5" w:uiPriority="64"/>
-    <w:lsdException w:name="Medium List 1 Accent 5" w:uiPriority="65"/>
-    <w:lsdException w:name="Medium List 2 Accent 5" w:uiPriority="66"/>
-    <w:lsdException w:name="Medium Grid 1 Accent 5" w:uiPriority="67"/>
-    <w:lsdException w:name="Medium Grid 2 Accent 5" w:uiPriority="68"/>
-    <w:lsdException w:name="Medium Grid 3 Accent 5" w:uiPriority="69"/>
-    <w:lsdException w:name="Dark List Accent 5" w:uiPriority="70"/>
-    <w:lsdException w:name="Colorful Shading Accent 5" w:uiPriority="71"/>
-    <w:lsdException w:name="Colorful List Accent 5" w:uiPriority="72"/>
-    <w:lsdException w:name="Colorful Grid Accent 5" w:uiPriority="73"/>
-    <w:lsdException w:name="Light Shading Accent 6" w:uiPriority="60"/>
-    <w:lsdException w:name="Light List Accent 6" w:uiPriority="61"/>
-    <w:lsdException w:name="Light Grid Accent 6" w:uiPriority="62"/>
-    <w:lsdException w:name="Medium Shading 1 Accent 6" w:uiPriority="63"/>
-    <w:lsdException w:name="Medium Shading 2 Accent 6" w:uiPriority="64"/>
-    <w:lsdException w:name="Medium List 1 Accent 6" w:uiPriority="65"/>
-    <w:lsdException w:name="Medium List 2 Accent 6" w:uiPriority="66"/>
-    <w:lsdException w:name="Medium Grid 1 Accent 6" w:uiPriority="67"/>
-    <w:lsdException w:name="Medium Grid 2 Accent 6" w:uiPriority="68"/>
-    <w:lsdException w:name="Medium Grid 3 Accent 6" w:uiPriority="69"/>
-    <w:lsdException w:name="Dark List Accent 6" w:uiPriority="70"/>
-    <w:lsdException w:name="Colorful Shading Accent 6" w:uiPriority="71"/>
-    <w:lsdException w:name="Colorful List Accent 6" w:uiPriority="72"/>
-    <w:lsdException w:name="Colorful Grid Accent 6" w:uiPriority="73"/>
-    <w:lsdException w:name="Subtle Emphasis" w:uiPriority="19" w:qFormat="1"/>
-    <w:lsdException w:name="Intense Emphasis" w:uiPriority="21" w:qFormat="1"/>
-    <w:lsdException w:name="Subtle Reference" w:uiPriority="31" w:qFormat="1"/>
-    <w:lsdException w:name="Intense Reference" w:uiPriority="32" w:qFormat="1"/>
-    <w:lsdException w:name="Book Title" w:uiPriority="33" w:qFormat="1"/>
-    <w:lsdException w:name="Bibliography" w:semiHidden="1" w:uiPriority="37" w:unhideWhenUsed="1"/>
-    <w:lsdException w:name="TOC Heading" w:semiHidden="1" w:uiPriority="39" w:unhideWhenUsed="1" w:qFormat="1"/>
-    <w:lsdException w:name="Plain Table 1" w:uiPriority="41"/>
-    <w:lsdException w:name="Plain Table 2" w:uiPriority="42"/>
-    <w:lsdException w:name="Plain Table 3" w:uiPriority="43"/>
-    <w:lsdException w:name="Plain Table 4" w:uiPriority="44"/>
-    <w:lsdException w:name="Plain Table 5" w:uiPriority="45"/>
-    <w:lsdException w:name="Grid Table Light" w:uiPriority="40"/>
-    <w:lsdException w:name="Grid Table 1 Light" w:uiPriority="46"/>
-    <w:lsdException w:name="Grid Table 2" w:uiPriority="47"/>
-    <w:lsdException w:name="Grid Table 3" w:uiPriority="48"/>
-    <w:lsdException w:name="Grid Table 4" w:uiPriority="49"/>
-    <w:lsdException w:name="Grid Table 5 Dark" w:uiPriority="50"/>
-    <w:lsdException w:name="Grid Table 6 Colorful" w:uiPriority="51"/>
-    <w:lsdException w:name="Grid Table 7 Colorful" w:uiPriority="52"/>
-    <w:lsdException w:name="Grid Table 1 Light Accent 1" w:uiPriority="46"/>
-    <w:lsdException w:name="Grid Table 2 Accent 1" w:uiPriority="47"/>
-    <w:lsdException w:name="Grid Table 3 Accent 1" w:uiPriority="48"/>
-    <w:lsdException w:name="Grid Table 4 Accent 1" w:uiPriority="49"/>
-    <w:lsdException w:name="Grid Table 5 Dark Accent 1" w:uiPriority="50"/>
-    <w:lsdException w:name="Grid Table 6 Colorful Accent 1" w:uiPriority="51"/>
-    <w:lsdException w:name="Grid Table 7 Colorful Accent 1" w:uiPriority="52"/>
-    <w:lsdException w:name="Grid Table 1 Light Accent 2" w:uiPriority="46"/>
-    <w:lsdException w:name="Grid Table 2 Accent 2" w:uiPriority="47"/>
-    <w:lsdException w:name="Grid Table 3 Accent 2" w:uiPriority="48"/>
-    <w:lsdException w:name="Grid Table 4 Accent 2" w:uiPriority="49"/>
-    <w:lsdException w:name="Grid Table 5 Dark Accent 2" w:uiPriority="50"/>
-    <w:lsdException w:name="Grid Table 6 Colorful Accent 2" w:uiPriority="51"/>
-    <w:lsdException w:name="Grid Table 7 Colorful Accent 2" w:uiPriority="52"/>
-    <w:lsdException w:name="Grid Table 1 Light Accent 3" w:uiPriority="46"/>
-    <w:lsdException w:name="Grid Table 2 Accent 3" w:uiPriority="47"/>
-    <w:lsdException w:name="Grid Table 3 Accent 3" w:uiPriority="48"/>
-    <w:lsdException w:name="Grid Table 4 Accent 3" w:uiPriority="49"/>
-    <w:lsdException w:name="Grid Table 5 Dark Accent 3" w:uiPriority="50"/>
-    <w:lsdException w:name="Grid Table 6 Colorful Accent 3" w:uiPriority="51"/>
-    <w:lsdException w:name="Grid Table 7 Colorful Accent 3" w:uiPriority="52"/>
-    <w:lsdException w:name="Grid Table 1 Light Accent 4" w:uiPriority="46"/>
-    <w:lsdException w:name="Grid Table 2 Accent 4" w:uiPriority="47"/>
-    <w:lsdException w:name="Grid Table 3 Accent 4" w:uiPriority="48"/>
-    <w:lsdException w:name="Grid Table 4 Accent 4" w:uiPriority="49"/>
-    <w:lsdException w:name="Grid Table 5 Dark Accent 4" w:uiPriority="50"/>
-    <w:lsdException w:name="Grid Table 6 Colorful Accent 4" w:uiPriority="51"/>
-    <w:lsdException w:name="Grid Table 7 Colorful Accent 4" w:uiPriority="52"/>
-    <w:lsdException w:name="Grid Table 1 Light Accent 5" w:uiPriority="46"/>
-    <w:lsdException w:name="Grid Table 2 Accent 5" w:uiPriority="47"/>
-    <w:lsdException w:name="Grid Table 3 Accent 5" w:uiPriority="48"/>
-    <w:lsdException w:name="Grid Table 4 Accent 5" w:uiPriority="49"/>
-    <w:lsdException w:name="Grid Table 5 Dark Accent 5" w:uiPriority="50"/>
-    <w:lsdException w:name="Grid Table 6 Colorful Accent 5" w:uiPriority="51"/>
-    <w:lsdException w:name="Grid Table 7 Colorful Accent 5" w:uiPriority="52"/>
-    <w:lsdException w:name="Grid Table 1 Light Accent 6" w:uiPriority="46"/>
-    <w:lsdException w:name="Grid Table 2 Accent 6" w:uiPriority="47"/>
-    <w:lsdException w:name="Grid Table 3 Accent 6" w:uiPriority="48"/>
-    <w:lsdException w:name="Grid Table 4 Accent 6" w:uiPriority="49"/>
-    <w:lsdException w:name="Grid Table 5 Dark Accent 6" w:uiPriority="50"/>
-    <w:lsdException w:name="Grid Table 6 Colorful Accent 6" w:uiPriority="51"/>
-    <w:lsdException w:name="Grid Table 7 Colorful Accent 6" w:uiPriority="52"/>
-    <w:lsdException w:name="List Table 1 Light" w:uiPriority="46"/>
-    <w:lsdException w:name="List Table 2" w:uiPriority="47"/>
-    <w:lsdException w:name="List Table 3" w:uiPriority="48"/>
-    <w:lsdException w:name="List Table 4" w:uiPriority="49"/>
-    <w:lsdException w:name="List Table 5 Dark" w:uiPriority="50"/>
-    <w:lsdException w:name="List Table 6 Colorful" w:uiPriority="51"/>
-    <w:lsdException w:name="List Table 7 Colorful" w:uiPriority="52"/>
-    <w:lsdException w:name="List Table 1 Light Accent 1" w:uiPriority="46"/>
-    <w:lsdException w:name="List Table 2 Accent 1" w:uiPriority="47"/>
-    <w:lsdException w:name="List Table 3 Accent 1" w:uiPriority="48"/>
-    <w:lsdException w:name="List Table 4 Accent 1" w:uiPriority="49"/>
-    <w:lsdException w:name="List Table 5 Dark Accent 1" w:uiPriority="50"/>
-    <w:lsdException w:name="List Table 6 Colorful Accent 1" w:uiPriority="51"/>
-    <w:lsdException w:name="List Table 7 Colorful Accent 1" w:uiPriority="52"/>
-    <w:lsdException w:name="List Table 1 Light Accent 2" w:uiPriority="46"/>
-    <w:lsdException w:name="List Table 2 Accent 2" w:uiPriority="47"/>
-    <w:lsdException w:name="List Table 3 Accent 2" w:uiPriority="48"/>
-    <w:lsdException w:name="List Table 4 Accent 2" w:uiPriority="49"/>
-    <w:lsdException w:name="List Table 5 Dark Accent 2" w:uiPriority="50"/>
-    <w:lsdException w:name="List Table 6 Colorful Accent 2" w:uiPriority="51"/>
-    <w:lsdException w:name="List Table 7 Colorful Accent 2" w:uiPriority="52"/>
-    <w:lsdException w:name="List Table 1 Light Accent 3" w:uiPriority="46"/>
-    <w:lsdException w:name="List Table 2 Accent 3" w:uiPriority="47"/>
-    <w:lsdException w:name="List Table 3 Accent 3" w:uiPriority="48"/>
-    <w:lsdException w:name="List Table 4 Accent 3" w:uiPriority="49"/>
-    <w:lsdException w:name="List Table 5 Dark Accent 3" w:uiPriority="50"/>
-    <w:lsdException w:name="List Table 6 Colorful Accent 3" w:uiPriority="51"/>
-    <w:lsdException w:name="List Table 7 Colorful Accent 3" w:uiPriority="52"/>
-    <w:lsdException w:name="List Table 1 Light Accent 4" w:uiPriority="46"/>
-    <w:lsdException w:name="List Table 2 Accent 4" w:uiPriority="47"/>
-    <w:lsdException w:name="List Table 3 Accent 4" w:uiPriority="48"/>
-    <w:lsdException w:name="List Table 4 Accent 4" w:uiPriority="49"/>
-    <w:lsdException w:name="List Table 5 Dark Accent 4" w:uiPriority="50"/>
-    <w:lsdException w:name="List Table 6 Colorful Accent 4" w:uiPriority="51"/>
-    <w:lsdException w:name="List Table 7 Colorful Accent 4" w:uiPriority="52"/>
-    <w:lsdException w:name="List Table 1 Light Accent 5" w:uiPriority="46"/>
-    <w:lsdException w:name="List Table 2 Accent 5" w:uiPriority="47"/>
-    <w:lsdException w:name="List Table 3 Accent 5" w:uiPriority="48"/>
-    <w:lsdException w:name="List Table 4 Accent 5" w:uiPriority="49"/>
-    <w:lsdException w:name="List Table 5 Dark Accent 5" w:uiPriority="50"/>
-    <w:lsdException w:name="List Table 6 Colorful Accent 5" w:uiPriority="51"/>
-    <w:lsdException w:name="List Table 7 Colorful Accent 5" w:uiPriority="52"/>
-    <w:lsdException w:name="List Table 1 Light Accent 6" w:uiPriority="46"/>
-    <w:lsdException w:name="List Table 2 Accent 6" w:uiPriority="47"/>
-    <w:lsdException w:name="List Table 3 Accent 6" w:uiPriority="48"/>
-    <w:lsdException w:name="List Table 4 Accent 6" w:uiPriority="49"/>
-    <w:lsdException w:name="List Table 5 Dark Accent 6" w:uiPriority="50"/>
-    <w:lsdException w:name="List Table 6 Colorful Accent 6" w:uiPriority="51"/>
-    <w:lsdException w:name="List Table 7 Colorful Accent 6" w:uiPriority="52"/>
+    <w:lsdException w:name="Medium List 2 Accent 1" w:semiHidden="0" w:uiPriority="66" w:unhideWhenUsed="0"/>
+    <w:lsdException w:name="Medium Grid 1 Accent 1" w:semiHidden="0" w:uiPriority="67" w:unhideWhenUsed="0"/>
+    <w:lsdException w:name="Medium Grid 2 Accent 1" w:semiHidden="0" w:uiPriority="68" w:unhideWhenUsed="0"/>
+    <w:lsdException w:name="Medium Grid 3 Accent 1" w:semiHidden="0" w:uiPriority="69" w:unhideWhenUsed="0"/>
+    <w:lsdException w:name="Dark List Accent 1" w:semiHidden="0" w:uiPriority="70" w:unhideWhenUsed="0"/>
+    <w:lsdException w:name="Colorful Shading Accent 1" w:semiHidden="0" w:uiPriority="71" w:unhideWhenUsed="0"/>
+    <w:lsdException w:name="Colorful List Accent 1" w:semiHidden="0" w:uiPriority="72" w:unhideWhenUsed="0"/>
+    <w:lsdException w:name="Colorful Grid Accent 1" w:semiHidden="0" w:uiPriority="73" w:unhideWhenUsed="0"/>
+    <w:lsdException w:name="Light Shading Accent 2" w:semiHidden="0" w:uiPriority="60" w:unhideWhenUsed="0"/>
+    <w:lsdException w:name="Light List Accent 2" w:semiHidden="0" w:uiPriority="61" w:unhideWhenUsed="0"/>
+    <w:lsdException w:name="Light Grid Accent 2" w:semiHidden="0" w:uiPriority="62" w:unhideWhenUsed="0"/>
+    <w:lsdException w:name="Medium Shading 1 Accent 2" w:semiHidden="0" w:uiPriority="63" w:unhideWhenUsed="0"/>
+    <w:lsdException w:name="Medium Shading 2 Accent 2" w:semiHidden="0" w:uiPriority="64" w:unhideWhenUsed="0"/>
+    <w:lsdException w:name="Medium List 1 Accent 2" w:semiHidden="0" w:uiPriority="65" w:unhideWhenUsed="0"/>
+    <w:lsdException w:name="Medium List 2 Accent 2" w:semiHidden="0" w:uiPriority="66" w:unhideWhenUsed="0"/>
+    <w:lsdException w:name="Medium Grid 1 Accent 2" w:semiHidden="0" w:uiPriority="67" w:unhideWhenUsed="0"/>
+    <w:lsdException w:name="Medium Grid 2 Accent 2" w:semiHidden="0" w:uiPriority="68" w:unhideWhenUsed="0"/>
+    <w:lsdException w:name="Medium Grid 3 Accent 2" w:semiHidden="0" w:uiPriority="69" w:unhideWhenUsed="0"/>
+    <w:lsdException w:name="Dark List Accent 2" w:semiHidden="0" w:uiPriority="70" w:unhideWhenUsed="0"/>
+    <w:lsdException w:name="Colorful Shading Accent 2" w:semiHidden="0" w:uiPriority="71" w:unhideWhenUsed="0"/>
+    <w:lsdException w:name="Colorful List Accent 2" w:semiHidden="0" w:uiPriority="72" w:unhideWhenUsed="0"/>
+    <w:lsdException w:name="Colorful Grid Accent 2" w:semiHidden="0" w:uiPriority="73" w:unhideWhenUsed="0"/>
+    <w:lsdException w:name="Light Shading Accent 3" w:semiHidden="0" w:uiPriority="60" w:unhideWhenUsed="0"/>
+    <w:lsdException w:name="Light List Accent 3" w:semiHidden="0" w:uiPriority="61" w:unhideWhenUsed="0"/>
+    <w:lsdException w:name="Light Grid Accent 3" w:semiHidden="0" w:uiPriority="62" w:unhideWhenUsed="0"/>
+    <w:lsdException w:name="Medium Shading 1 Accent 3" w:semiHidden="0" w:uiPriority="63" w:unhideWhenUsed="0"/>
+    <w:lsdException w:name="Medium Shading 2 Accent 3" w:semiHidden="0" w:uiPriority="64" w:unhideWhenUsed="0"/>
+    <w:lsdException w:name="Medium List 1 Accent 3" w:semiHidden="0" w:uiPriority="65" w:unhideWhenUsed="0"/>
+    <w:lsdException w:name="Medium List 2 Accent 3" w:semiHidden="0" w:uiPriority="66" w:unhideWhenUsed="0"/>
+    <w:lsdException w:name="Medium Grid 1 Accent 3" w:semiHidden="0" w:uiPriority="67" w:unhideWhenUsed="0"/>
+    <w:lsdException w:name="Medium Grid 2 Accent 3" w:semiHidden="0" w:uiPriority="68" w:unhideWhenUsed="0"/>
+    <w:lsdException w:name="Medium Grid 3 Accent 3" w:semiHidden="0" w:uiPriority="69" w:unhideWhenUsed="0"/>
+    <w:lsdException w:name="Dark List Accent 3" w:semiHidden="0" w:uiPriority="70" w:unhideWhenUsed="0"/>
+    <w:lsdException w:name="Colorful Shading Accent 3" w:semiHidden="0" w:uiPriority="71" w:unhideWhenUsed="0"/>
+    <w:lsdException w:name="Colorful List Accent 3" w:semiHidden="0" w:uiPriority="72" w:unhideWhenUsed="0"/>
+    <w:lsdException w:name="Colorful Grid Accent 3" w:semiHidden="0" w:uiPriority="73" w:unhideWhenUsed="0"/>
+    <w:lsdException w:name="Light Shading Accent 4" w:semiHidden="0" w:uiPriority="60" w:unhideWhenUsed="0"/>
+    <w:lsdException w:name="Light List Accent 4" w:semiHidden="0" w:uiPriority="61" w:unhideWhenUsed="0"/>
+    <w:lsdException w:name="Light Grid Accent 4" w:semiHidden="0" w:uiPriority="62" w:unhideWhenUsed="0"/>
+    <w:lsdException w:name="Medium Shading 1 Accent 4" w:semiHidden="0" w:uiPriority="63" w:unhideWhenUsed="0"/>
+    <w:lsdException w:name="Medium Shading 2 Accent 4" w:semiHidden="0" w:uiPriority="64" w:unhideWhenUsed="0"/>
+    <w:lsdException w:name="Medium List 1 Accent 4" w:semiHidden="0" w:uiPriority="65" w:unhideWhenUsed="0"/>
+    <w:lsdException w:name="Medium List 2 Accent 4" w:semiHidden="0" w:uiPriority="66" w:unhideWhenUsed="0"/>
+    <w:lsdException w:name="Medium Grid 1 Accent 4" w:semiHidden="0" w:uiPriority="67" w:unhideWhenUsed="0"/>
+    <w:lsdException w:name="Medium Grid 2 Accent 4" w:semiHidden="0" w:uiPriority="68" w:unhideWhenUsed="0"/>
+    <w:lsdException w:name="Medium Grid 3 Accent 4" w:semiHidden="0" w:uiPriority="69" w:unhideWhenUsed="0"/>
+    <w:lsdException w:name="Dark List Accent 4" w:semiHidden="0" w:uiPriority="70" w:unhideWhenUsed="0"/>
+    <w:lsdException w:name="Colorful Shading Accent 4" w:semiHidden="0" w:uiPriority="71" w:unhideWhenUsed="0"/>
+    <w:lsdException w:name="Colorful List Accent 4" w:semiHidden="0" w:uiPriority="72" w:unhideWhenUsed="0"/>
+    <w:lsdException w:name="Colorful Grid Accent 4" w:semiHidden="0" w:uiPriority="73" w:unhideWhenUsed="0"/>
+    <w:lsdException w:name="Light Shading Accent 5" w:semiHidden="0" w:uiPriority="60" w:unhideWhenUsed="0"/>
+    <w:lsdException w:name="Light List Accent 5" w:semiHidden="0" w:uiPriority="61" w:unhideWhenUsed="0"/>
+    <w:lsdException w:name="Light Grid Accent 5" w:semiHidden="0" w:uiPriority="62" w:unhideWhenUsed="0"/>
+    <w:lsdException w:name="Medium Shading 1 Accent 5" w:semiHidden="0" w:uiPriority="63" w:unhideWhenUsed="0"/>
+    <w:lsdException w:name="Medium Shading 2 Accent 5" w:semiHidden="0" w:uiPriority="64" w:unhideWhenUsed="0"/>
+    <w:lsdException w:name="Medium List 1 Accent 5" w:semiHidden="0" w:uiPriority="65" w:unhideWhenUsed="0"/>
+    <w:lsdException w:name="Medium List 2 Accent 5" w:semiHidden="0" w:uiPriority="66" w:unhideWhenUsed="0"/>
+    <w:lsdException w:name="Medium Grid 1 Accent 5" w:semiHidden="0" w:uiPriority="67" w:unhideWhenUsed="0"/>
+    <w:lsdException w:name="Medium Grid 2 Accent 5" w:semiHidden="0" w:uiPriority="68" w:unhideWhenUsed="0"/>
+    <w:lsdException w:name="Medium Grid 3 Accent 5" w:semiHidden="0" w:uiPriority="69" w:unhideWhenUsed="0"/>
+    <w:lsdException w:name="Dark List Accent 5" w:semiHidden="0" w:uiPriority="70" w:unhideWhenUsed="0"/>
+    <w:lsdException w:name="Colorful Shading Accent 5" w:semiHidden="0" w:uiPriority="71" w:unhideWhenUsed="0"/>
+    <w:lsdException w:name="Colorful List Accent 5" w:semiHidden="0" w:uiPriority="72" w:unhideWhenUsed="0"/>
+    <w:lsdException w:name="Colorful Grid Accent 5" w:semiHidden="0" w:uiPriority="73" w:unhideWhenUsed="0"/>
+    <w:lsdException w:name="Light Shading Accent 6" w:semiHidden="0" w:uiPriority="60" w:unhideWhenUsed="0"/>
+    <w:lsdException w:name="Light List Accent 6" w:semiHidden="0" w:uiPriority="61" w:unhideWhenUsed="0"/>
+    <w:lsdException w:name="Light Grid Accent 6" w:semiHidden="0" w:uiPriority="62" w:unhideWhenUsed="0"/>
+    <w:lsdException w:name="Medium Shading 1 Accent 6" w:semiHidden="0" w:uiPriority="63" w:unhideWhenUsed="0"/>
+    <w:lsdException w:name="Medium Shading 2 Accent 6" w:semiHidden="0" w:uiPriority="64" w:unhideWhenUsed="0"/>
+    <w:lsdException w:name="Medium List 1 Accent 6" w:semiHidden="0" w:uiPriority="65" w:unhideWhenUsed="0"/>
+    <w:lsdException w:name="Medium List 2 Accent 6" w:semiHidden="0" w:uiPriority="66" w:unhideWhenUsed="0"/>
+    <w:lsdException w:name="Medium Grid 1 Accent 6" w:semiHidden="0" w:uiPriority="67" w:unhideWhenUsed="0"/>
+    <w:lsdException w:name="Medium Grid 2 Accent 6" w:semiHidden="0" w:uiPriority="68" w:unhideWhenUsed="0"/>
+    <w:lsdException w:name="Medium Grid 3 Accent 6" w:semiHidden="0" w:uiPriority="69" w:unhideWhenUsed="0"/>
+    <w:lsdException w:name="Dark List Accent 6" w:semiHidden="0" w:uiPriority="70" w:unhideWhenUsed="0"/>
+    <w:lsdException w:name="Colorful Shading Accent 6" w:semiHidden="0" w:uiPriority="71" w:unhideWhenUsed="0"/>
+    <w:lsdException w:name="Colorful List Accent 6" w:semiHidden="0" w:uiPriority="72" w:unhideWhenUsed="0"/>
+    <w:lsdException w:name="Colorful Grid Accent 6" w:semiHidden="0" w:uiPriority="73" w:unhideWhenUsed="0"/>
+    <w:lsdException w:name="Subtle Emphasis" w:semiHidden="0" w:uiPriority="19" w:unhideWhenUsed="0" w:qFormat="1"/>
+    <w:lsdException w:name="Intense Emphasis" w:semiHidden="0" w:uiPriority="21" w:unhideWhenUsed="0" w:qFormat="1"/>
+    <w:lsdException w:name="Subtle Reference" w:semiHidden="0" w:uiPriority="31" w:unhideWhenUsed="0" w:qFormat="1"/>
+    <w:lsdException w:name="Intense Reference" w:semiHidden="0" w:uiPriority="32" w:unhideWhenUsed="0" w:qFormat="1"/>
+    <w:lsdException w:name="Book Title" w:semiHidden="0" w:uiPriority="33" w:unhideWhenUsed="0" w:qFormat="1"/>
+    <w:lsdException w:name="Bibliography" w:uiPriority="37"/>
+    <w:lsdException w:name="TOC Heading" w:uiPriority="39" w:qFormat="1"/>
   </w:latentStyles>
   <w:style w:type="paragraph" w:default="1" w:styleId="Normal">
     <w:name w:val="Normal"/>
     <w:qFormat/>
+    <w:pPr>
+      <w:suppressAutoHyphens/>
+    </w:pPr>
     <w:rPr>
       <w:rFonts w:eastAsia="Times New Roman"/>
       <w:sz w:val="24"/>
       <w:szCs w:val="24"/>
-      <w:lang w:val="en-US" w:eastAsia="en-US" w:bidi="ar-SA"/>
     </w:rPr>
   </w:style>
   <w:style w:type="character" w:default="1" w:styleId="DefaultParagraphFont">
@@ -4332,34 +4431,24 @@
     <w:semiHidden/>
     <w:unhideWhenUsed/>
   </w:style>
-  <w:style w:type="paragraph" w:customStyle="1" w:styleId="Heading">
-    <w:name w:val="Heading"/>
+  <w:style w:type="paragraph" w:styleId="BalloonText">
+    <w:name w:val="Balloon Text"/>
     <w:basedOn w:val="Normal"/>
-    <w:next w:val="BodyText"/>
+    <w:semiHidden/>
     <w:qFormat/>
-    <w:pPr>
-      <w:keepNext/>
-      <w:spacing w:before="240" w:after="120"/>
-    </w:pPr>
     <w:rPr>
-      <w:rFonts w:ascii="Liberation Sans" w:eastAsia="Microsoft YaHei" w:hAnsi="Liberation Sans" w:cs="Lucida Sans"/>
-      <w:sz w:val="28"/>
-      <w:szCs w:val="28"/>
+      <w:rFonts w:ascii="Tahoma" w:hAnsi="Tahoma" w:cs="Tahoma"/>
+      <w:sz w:val="16"/>
+      <w:szCs w:val="16"/>
     </w:rPr>
   </w:style>
   <w:style w:type="paragraph" w:styleId="BodyText">
     <w:name w:val="Body Text"/>
     <w:basedOn w:val="Normal"/>
+    <w:qFormat/>
     <w:pPr>
       <w:spacing w:after="140" w:line="276" w:lineRule="auto"/>
     </w:pPr>
-  </w:style>
-  <w:style w:type="paragraph" w:styleId="List">
-    <w:name w:val="List"/>
-    <w:basedOn w:val="BodyText"/>
-    <w:rPr>
-      <w:rFonts w:cs="Lucida Sans"/>
-    </w:rPr>
   </w:style>
   <w:style w:type="paragraph" w:styleId="Caption">
     <w:name w:val="caption"/>
@@ -4374,33 +4463,6 @@
       <w:i/>
       <w:iCs/>
     </w:rPr>
-  </w:style>
-  <w:style w:type="paragraph" w:customStyle="1" w:styleId="Index">
-    <w:name w:val="Index"/>
-    <w:basedOn w:val="Normal"/>
-    <w:qFormat/>
-    <w:pPr>
-      <w:suppressLineNumbers/>
-    </w:pPr>
-    <w:rPr>
-      <w:rFonts w:cs="Lucida Sans"/>
-    </w:rPr>
-  </w:style>
-  <w:style w:type="paragraph" w:styleId="BalloonText">
-    <w:name w:val="Balloon Text"/>
-    <w:basedOn w:val="Normal"/>
-    <w:semiHidden/>
-    <w:qFormat/>
-    <w:rPr>
-      <w:rFonts w:ascii="Tahoma" w:hAnsi="Tahoma" w:cs="Tahoma"/>
-      <w:sz w:val="16"/>
-      <w:szCs w:val="16"/>
-    </w:rPr>
-  </w:style>
-  <w:style w:type="paragraph" w:customStyle="1" w:styleId="HeaderandFooter">
-    <w:name w:val="Header and Footer"/>
-    <w:basedOn w:val="Normal"/>
-    <w:qFormat/>
   </w:style>
   <w:style w:type="paragraph" w:styleId="Footer">
     <w:name w:val="footer"/>
@@ -4448,13 +4510,71 @@
         <w:tab w:val="left" w:pos="13740"/>
         <w:tab w:val="left" w:pos="14656"/>
       </w:tabs>
+      <w:suppressAutoHyphens/>
     </w:pPr>
     <w:rPr>
       <w:rFonts w:ascii="SimSun" w:hAnsi="SimSun" w:cs="SimSun"/>
       <w:sz w:val="24"/>
       <w:szCs w:val="24"/>
-      <w:lang w:val="en-US" w:bidi="ar-SA"/>
+      <w:lang w:eastAsia="zh-CN"/>
     </w:rPr>
+  </w:style>
+  <w:style w:type="paragraph" w:styleId="List">
+    <w:name w:val="List"/>
+    <w:basedOn w:val="BodyText"/>
+    <w:qFormat/>
+    <w:rPr>
+      <w:rFonts w:cs="Lucida Sans"/>
+    </w:rPr>
+  </w:style>
+  <w:style w:type="table" w:styleId="TableGrid">
+    <w:name w:val="Table Grid"/>
+    <w:basedOn w:val="TableNormal"/>
+    <w:qFormat/>
+    <w:pPr>
+      <w:jc w:val="both"/>
+    </w:pPr>
+    <w:tblPr>
+      <w:tblBorders>
+        <w:top w:val="single" w:sz="4" w:space="0" w:color="auto"/>
+        <w:left w:val="single" w:sz="4" w:space="0" w:color="auto"/>
+        <w:bottom w:val="single" w:sz="4" w:space="0" w:color="auto"/>
+        <w:right w:val="single" w:sz="4" w:space="0" w:color="auto"/>
+        <w:insideH w:val="single" w:sz="4" w:space="0" w:color="auto"/>
+        <w:insideV w:val="single" w:sz="4" w:space="0" w:color="auto"/>
+      </w:tblBorders>
+    </w:tblPr>
+  </w:style>
+  <w:style w:type="paragraph" w:customStyle="1" w:styleId="Heading">
+    <w:name w:val="Heading"/>
+    <w:basedOn w:val="Normal"/>
+    <w:next w:val="BodyText"/>
+    <w:qFormat/>
+    <w:pPr>
+      <w:keepNext/>
+      <w:spacing w:before="240" w:after="120"/>
+    </w:pPr>
+    <w:rPr>
+      <w:rFonts w:ascii="Liberation Sans" w:eastAsia="Microsoft YaHei" w:hAnsi="Liberation Sans" w:cs="Lucida Sans"/>
+      <w:sz w:val="28"/>
+      <w:szCs w:val="28"/>
+    </w:rPr>
+  </w:style>
+  <w:style w:type="paragraph" w:customStyle="1" w:styleId="Index">
+    <w:name w:val="Index"/>
+    <w:basedOn w:val="Normal"/>
+    <w:qFormat/>
+    <w:pPr>
+      <w:suppressLineNumbers/>
+    </w:pPr>
+    <w:rPr>
+      <w:rFonts w:cs="Lucida Sans"/>
+    </w:rPr>
+  </w:style>
+  <w:style w:type="paragraph" w:customStyle="1" w:styleId="HeaderandFooter">
+    <w:name w:val="Header and Footer"/>
+    <w:basedOn w:val="Normal"/>
+    <w:qFormat/>
   </w:style>
   <w:style w:type="paragraph" w:styleId="ListParagraph">
     <w:name w:val="List Paragraph"/>
@@ -4489,23 +4609,195 @@
     <w:basedOn w:val="Normal"/>
     <w:qFormat/>
   </w:style>
-  <w:style w:type="table" w:styleId="TableGrid">
-    <w:name w:val="Table Grid"/>
-    <w:basedOn w:val="TableNormal"/>
+</w:styles>
+</file>
+
+<file path=word/stylesWithEffects.xml><?xml version="1.0" encoding="utf-8"?>
+<w:styles xmlns:wpc="http://schemas.microsoft.com/office/word/2010/wordprocessingCanvas" xmlns:mc="http://schemas.openxmlformats.org/markup-compatibility/2006" xmlns:o="urn:schemas-microsoft-com:office:office" xmlns:r="http://schemas.openxmlformats.org/officeDocument/2006/relationships" xmlns:m="http://schemas.openxmlformats.org/officeDocument/2006/math" xmlns:v="urn:schemas-microsoft-com:vml" xmlns:wp14="http://schemas.microsoft.com/office/word/2010/wordprocessingDrawing" xmlns:wp="http://schemas.openxmlformats.org/drawingml/2006/wordprocessingDrawing" xmlns:w10="urn:schemas-microsoft-com:office:word" xmlns:w="http://schemas.openxmlformats.org/wordprocessingml/2006/main" xmlns:w14="http://schemas.microsoft.com/office/word/2010/wordml" xmlns:wpg="http://schemas.microsoft.com/office/word/2010/wordprocessingGroup" xmlns:wpi="http://schemas.microsoft.com/office/word/2010/wordprocessingInk" xmlns:wne="http://schemas.microsoft.com/office/word/2006/wordml" xmlns:wps="http://schemas.microsoft.com/office/word/2010/wordprocessingShape" mc:Ignorable="w14 wp14">
+  <w:docDefaults>
+    <w:rPrDefault>
+      <w:rPr>
+        <w:rFonts w:asciiTheme="minorHAnsi" w:eastAsiaTheme="minorEastAsia" w:hAnsiTheme="minorHAnsi" w:cstheme="minorBidi"/>
+        <w:sz w:val="22"/>
+        <w:szCs w:val="22"/>
+        <w:lang w:val="en-US" w:eastAsia="en-US" w:bidi="ar-SA"/>
+      </w:rPr>
+    </w:rPrDefault>
+    <w:pPrDefault>
+      <w:pPr>
+        <w:spacing w:after="200" w:line="276" w:lineRule="auto"/>
+      </w:pPr>
+    </w:pPrDefault>
+  </w:docDefaults>
+  <w:latentStyles w:defLockedState="0" w:defUIPriority="99" w:defSemiHidden="1" w:defUnhideWhenUsed="1" w:defQFormat="0" w:count="267">
+    <w:lsdException w:name="Normal" w:semiHidden="0" w:uiPriority="0" w:unhideWhenUsed="0" w:qFormat="1"/>
+    <w:lsdException w:name="heading 1" w:semiHidden="0" w:uiPriority="9" w:unhideWhenUsed="0" w:qFormat="1"/>
+    <w:lsdException w:name="heading 2" w:uiPriority="9" w:qFormat="1"/>
+    <w:lsdException w:name="heading 3" w:uiPriority="9" w:qFormat="1"/>
+    <w:lsdException w:name="heading 4" w:uiPriority="9" w:qFormat="1"/>
+    <w:lsdException w:name="heading 5" w:uiPriority="9" w:qFormat="1"/>
+    <w:lsdException w:name="heading 6" w:uiPriority="9" w:qFormat="1"/>
+    <w:lsdException w:name="heading 7" w:uiPriority="9" w:qFormat="1"/>
+    <w:lsdException w:name="heading 8" w:uiPriority="9" w:qFormat="1"/>
+    <w:lsdException w:name="heading 9" w:uiPriority="9" w:qFormat="1"/>
+    <w:lsdException w:name="toc 1" w:uiPriority="39"/>
+    <w:lsdException w:name="toc 2" w:uiPriority="39"/>
+    <w:lsdException w:name="toc 3" w:uiPriority="39"/>
+    <w:lsdException w:name="toc 4" w:uiPriority="39"/>
+    <w:lsdException w:name="toc 5" w:uiPriority="39"/>
+    <w:lsdException w:name="toc 6" w:uiPriority="39"/>
+    <w:lsdException w:name="toc 7" w:uiPriority="39"/>
+    <w:lsdException w:name="toc 8" w:uiPriority="39"/>
+    <w:lsdException w:name="toc 9" w:uiPriority="39"/>
+    <w:lsdException w:name="caption" w:uiPriority="35" w:qFormat="1"/>
+    <w:lsdException w:name="Title" w:semiHidden="0" w:uiPriority="10" w:unhideWhenUsed="0" w:qFormat="1"/>
+    <w:lsdException w:name="Default Paragraph Font" w:uiPriority="1"/>
+    <w:lsdException w:name="Subtitle" w:semiHidden="0" w:uiPriority="11" w:unhideWhenUsed="0" w:qFormat="1"/>
+    <w:lsdException w:name="Strong" w:semiHidden="0" w:uiPriority="22" w:unhideWhenUsed="0" w:qFormat="1"/>
+    <w:lsdException w:name="Emphasis" w:semiHidden="0" w:uiPriority="20" w:unhideWhenUsed="0" w:qFormat="1"/>
+    <w:lsdException w:name="Table Grid" w:semiHidden="0" w:uiPriority="59" w:unhideWhenUsed="0"/>
+    <w:lsdException w:name="Placeholder Text" w:unhideWhenUsed="0"/>
+    <w:lsdException w:name="No Spacing" w:semiHidden="0" w:uiPriority="1" w:unhideWhenUsed="0" w:qFormat="1"/>
+    <w:lsdException w:name="Light Shading" w:semiHidden="0" w:uiPriority="60" w:unhideWhenUsed="0"/>
+    <w:lsdException w:name="Light List" w:semiHidden="0" w:uiPriority="61" w:unhideWhenUsed="0"/>
+    <w:lsdException w:name="Light Grid" w:semiHidden="0" w:uiPriority="62" w:unhideWhenUsed="0"/>
+    <w:lsdException w:name="Medium Shading 1" w:semiHidden="0" w:uiPriority="63" w:unhideWhenUsed="0"/>
+    <w:lsdException w:name="Medium Shading 2" w:semiHidden="0" w:uiPriority="64" w:unhideWhenUsed="0"/>
+    <w:lsdException w:name="Medium List 1" w:semiHidden="0" w:uiPriority="65" w:unhideWhenUsed="0"/>
+    <w:lsdException w:name="Medium List 2" w:semiHidden="0" w:uiPriority="66" w:unhideWhenUsed="0"/>
+    <w:lsdException w:name="Medium Grid 1" w:semiHidden="0" w:uiPriority="67" w:unhideWhenUsed="0"/>
+    <w:lsdException w:name="Medium Grid 2" w:semiHidden="0" w:uiPriority="68" w:unhideWhenUsed="0"/>
+    <w:lsdException w:name="Medium Grid 3" w:semiHidden="0" w:uiPriority="69" w:unhideWhenUsed="0"/>
+    <w:lsdException w:name="Dark List" w:semiHidden="0" w:uiPriority="70" w:unhideWhenUsed="0"/>
+    <w:lsdException w:name="Colorful Shading" w:semiHidden="0" w:uiPriority="71" w:unhideWhenUsed="0"/>
+    <w:lsdException w:name="Colorful List" w:semiHidden="0" w:uiPriority="72" w:unhideWhenUsed="0"/>
+    <w:lsdException w:name="Colorful Grid" w:semiHidden="0" w:uiPriority="73" w:unhideWhenUsed="0"/>
+    <w:lsdException w:name="Light Shading Accent 1" w:semiHidden="0" w:uiPriority="60" w:unhideWhenUsed="0"/>
+    <w:lsdException w:name="Light List Accent 1" w:semiHidden="0" w:uiPriority="61" w:unhideWhenUsed="0"/>
+    <w:lsdException w:name="Light Grid Accent 1" w:semiHidden="0" w:uiPriority="62" w:unhideWhenUsed="0"/>
+    <w:lsdException w:name="Medium Shading 1 Accent 1" w:semiHidden="0" w:uiPriority="63" w:unhideWhenUsed="0"/>
+    <w:lsdException w:name="Medium Shading 2 Accent 1" w:semiHidden="0" w:uiPriority="64" w:unhideWhenUsed="0"/>
+    <w:lsdException w:name="Medium List 1 Accent 1" w:semiHidden="0" w:uiPriority="65" w:unhideWhenUsed="0"/>
+    <w:lsdException w:name="Revision" w:unhideWhenUsed="0"/>
+    <w:lsdException w:name="List Paragraph" w:semiHidden="0" w:uiPriority="34" w:unhideWhenUsed="0" w:qFormat="1"/>
+    <w:lsdException w:name="Quote" w:semiHidden="0" w:uiPriority="29" w:unhideWhenUsed="0" w:qFormat="1"/>
+    <w:lsdException w:name="Intense Quote" w:semiHidden="0" w:uiPriority="30" w:unhideWhenUsed="0" w:qFormat="1"/>
+    <w:lsdException w:name="Medium List 2 Accent 1" w:semiHidden="0" w:uiPriority="66" w:unhideWhenUsed="0"/>
+    <w:lsdException w:name="Medium Grid 1 Accent 1" w:semiHidden="0" w:uiPriority="67" w:unhideWhenUsed="0"/>
+    <w:lsdException w:name="Medium Grid 2 Accent 1" w:semiHidden="0" w:uiPriority="68" w:unhideWhenUsed="0"/>
+    <w:lsdException w:name="Medium Grid 3 Accent 1" w:semiHidden="0" w:uiPriority="69" w:unhideWhenUsed="0"/>
+    <w:lsdException w:name="Dark List Accent 1" w:semiHidden="0" w:uiPriority="70" w:unhideWhenUsed="0"/>
+    <w:lsdException w:name="Colorful Shading Accent 1" w:semiHidden="0" w:uiPriority="71" w:unhideWhenUsed="0"/>
+    <w:lsdException w:name="Colorful List Accent 1" w:semiHidden="0" w:uiPriority="72" w:unhideWhenUsed="0"/>
+    <w:lsdException w:name="Colorful Grid Accent 1" w:semiHidden="0" w:uiPriority="73" w:unhideWhenUsed="0"/>
+    <w:lsdException w:name="Light Shading Accent 2" w:semiHidden="0" w:uiPriority="60" w:unhideWhenUsed="0"/>
+    <w:lsdException w:name="Light List Accent 2" w:semiHidden="0" w:uiPriority="61" w:unhideWhenUsed="0"/>
+    <w:lsdException w:name="Light Grid Accent 2" w:semiHidden="0" w:uiPriority="62" w:unhideWhenUsed="0"/>
+    <w:lsdException w:name="Medium Shading 1 Accent 2" w:semiHidden="0" w:uiPriority="63" w:unhideWhenUsed="0"/>
+    <w:lsdException w:name="Medium Shading 2 Accent 2" w:semiHidden="0" w:uiPriority="64" w:unhideWhenUsed="0"/>
+    <w:lsdException w:name="Medium List 1 Accent 2" w:semiHidden="0" w:uiPriority="65" w:unhideWhenUsed="0"/>
+    <w:lsdException w:name="Medium List 2 Accent 2" w:semiHidden="0" w:uiPriority="66" w:unhideWhenUsed="0"/>
+    <w:lsdException w:name="Medium Grid 1 Accent 2" w:semiHidden="0" w:uiPriority="67" w:unhideWhenUsed="0"/>
+    <w:lsdException w:name="Medium Grid 2 Accent 2" w:semiHidden="0" w:uiPriority="68" w:unhideWhenUsed="0"/>
+    <w:lsdException w:name="Medium Grid 3 Accent 2" w:semiHidden="0" w:uiPriority="69" w:unhideWhenUsed="0"/>
+    <w:lsdException w:name="Dark List Accent 2" w:semiHidden="0" w:uiPriority="70" w:unhideWhenUsed="0"/>
+    <w:lsdException w:name="Colorful Shading Accent 2" w:semiHidden="0" w:uiPriority="71" w:unhideWhenUsed="0"/>
+    <w:lsdException w:name="Colorful List Accent 2" w:semiHidden="0" w:uiPriority="72" w:unhideWhenUsed="0"/>
+    <w:lsdException w:name="Colorful Grid Accent 2" w:semiHidden="0" w:uiPriority="73" w:unhideWhenUsed="0"/>
+    <w:lsdException w:name="Light Shading Accent 3" w:semiHidden="0" w:uiPriority="60" w:unhideWhenUsed="0"/>
+    <w:lsdException w:name="Light List Accent 3" w:semiHidden="0" w:uiPriority="61" w:unhideWhenUsed="0"/>
+    <w:lsdException w:name="Light Grid Accent 3" w:semiHidden="0" w:uiPriority="62" w:unhideWhenUsed="0"/>
+    <w:lsdException w:name="Medium Shading 1 Accent 3" w:semiHidden="0" w:uiPriority="63" w:unhideWhenUsed="0"/>
+    <w:lsdException w:name="Medium Shading 2 Accent 3" w:semiHidden="0" w:uiPriority="64" w:unhideWhenUsed="0"/>
+    <w:lsdException w:name="Medium List 1 Accent 3" w:semiHidden="0" w:uiPriority="65" w:unhideWhenUsed="0"/>
+    <w:lsdException w:name="Medium List 2 Accent 3" w:semiHidden="0" w:uiPriority="66" w:unhideWhenUsed="0"/>
+    <w:lsdException w:name="Medium Grid 1 Accent 3" w:semiHidden="0" w:uiPriority="67" w:unhideWhenUsed="0"/>
+    <w:lsdException w:name="Medium Grid 2 Accent 3" w:semiHidden="0" w:uiPriority="68" w:unhideWhenUsed="0"/>
+    <w:lsdException w:name="Medium Grid 3 Accent 3" w:semiHidden="0" w:uiPriority="69" w:unhideWhenUsed="0"/>
+    <w:lsdException w:name="Dark List Accent 3" w:semiHidden="0" w:uiPriority="70" w:unhideWhenUsed="0"/>
+    <w:lsdException w:name="Colorful Shading Accent 3" w:semiHidden="0" w:uiPriority="71" w:unhideWhenUsed="0"/>
+    <w:lsdException w:name="Colorful List Accent 3" w:semiHidden="0" w:uiPriority="72" w:unhideWhenUsed="0"/>
+    <w:lsdException w:name="Colorful Grid Accent 3" w:semiHidden="0" w:uiPriority="73" w:unhideWhenUsed="0"/>
+    <w:lsdException w:name="Light Shading Accent 4" w:semiHidden="0" w:uiPriority="60" w:unhideWhenUsed="0"/>
+    <w:lsdException w:name="Light List Accent 4" w:semiHidden="0" w:uiPriority="61" w:unhideWhenUsed="0"/>
+    <w:lsdException w:name="Light Grid Accent 4" w:semiHidden="0" w:uiPriority="62" w:unhideWhenUsed="0"/>
+    <w:lsdException w:name="Medium Shading 1 Accent 4" w:semiHidden="0" w:uiPriority="63" w:unhideWhenUsed="0"/>
+    <w:lsdException w:name="Medium Shading 2 Accent 4" w:semiHidden="0" w:uiPriority="64" w:unhideWhenUsed="0"/>
+    <w:lsdException w:name="Medium List 1 Accent 4" w:semiHidden="0" w:uiPriority="65" w:unhideWhenUsed="0"/>
+    <w:lsdException w:name="Medium List 2 Accent 4" w:semiHidden="0" w:uiPriority="66" w:unhideWhenUsed="0"/>
+    <w:lsdException w:name="Medium Grid 1 Accent 4" w:semiHidden="0" w:uiPriority="67" w:unhideWhenUsed="0"/>
+    <w:lsdException w:name="Medium Grid 2 Accent 4" w:semiHidden="0" w:uiPriority="68" w:unhideWhenUsed="0"/>
+    <w:lsdException w:name="Medium Grid 3 Accent 4" w:semiHidden="0" w:uiPriority="69" w:unhideWhenUsed="0"/>
+    <w:lsdException w:name="Dark List Accent 4" w:semiHidden="0" w:uiPriority="70" w:unhideWhenUsed="0"/>
+    <w:lsdException w:name="Colorful Shading Accent 4" w:semiHidden="0" w:uiPriority="71" w:unhideWhenUsed="0"/>
+    <w:lsdException w:name="Colorful List Accent 4" w:semiHidden="0" w:uiPriority="72" w:unhideWhenUsed="0"/>
+    <w:lsdException w:name="Colorful Grid Accent 4" w:semiHidden="0" w:uiPriority="73" w:unhideWhenUsed="0"/>
+    <w:lsdException w:name="Light Shading Accent 5" w:semiHidden="0" w:uiPriority="60" w:unhideWhenUsed="0"/>
+    <w:lsdException w:name="Light List Accent 5" w:semiHidden="0" w:uiPriority="61" w:unhideWhenUsed="0"/>
+    <w:lsdException w:name="Light Grid Accent 5" w:semiHidden="0" w:uiPriority="62" w:unhideWhenUsed="0"/>
+    <w:lsdException w:name="Medium Shading 1 Accent 5" w:semiHidden="0" w:uiPriority="63" w:unhideWhenUsed="0"/>
+    <w:lsdException w:name="Medium Shading 2 Accent 5" w:semiHidden="0" w:uiPriority="64" w:unhideWhenUsed="0"/>
+    <w:lsdException w:name="Medium List 1 Accent 5" w:semiHidden="0" w:uiPriority="65" w:unhideWhenUsed="0"/>
+    <w:lsdException w:name="Medium List 2 Accent 5" w:semiHidden="0" w:uiPriority="66" w:unhideWhenUsed="0"/>
+    <w:lsdException w:name="Medium Grid 1 Accent 5" w:semiHidden="0" w:uiPriority="67" w:unhideWhenUsed="0"/>
+    <w:lsdException w:name="Medium Grid 2 Accent 5" w:semiHidden="0" w:uiPriority="68" w:unhideWhenUsed="0"/>
+    <w:lsdException w:name="Medium Grid 3 Accent 5" w:semiHidden="0" w:uiPriority="69" w:unhideWhenUsed="0"/>
+    <w:lsdException w:name="Dark List Accent 5" w:semiHidden="0" w:uiPriority="70" w:unhideWhenUsed="0"/>
+    <w:lsdException w:name="Colorful Shading Accent 5" w:semiHidden="0" w:uiPriority="71" w:unhideWhenUsed="0"/>
+    <w:lsdException w:name="Colorful List Accent 5" w:semiHidden="0" w:uiPriority="72" w:unhideWhenUsed="0"/>
+    <w:lsdException w:name="Colorful Grid Accent 5" w:semiHidden="0" w:uiPriority="73" w:unhideWhenUsed="0"/>
+    <w:lsdException w:name="Light Shading Accent 6" w:semiHidden="0" w:uiPriority="60" w:unhideWhenUsed="0"/>
+    <w:lsdException w:name="Light List Accent 6" w:semiHidden="0" w:uiPriority="61" w:unhideWhenUsed="0"/>
+    <w:lsdException w:name="Light Grid Accent 6" w:semiHidden="0" w:uiPriority="62" w:unhideWhenUsed="0"/>
+    <w:lsdException w:name="Medium Shading 1 Accent 6" w:semiHidden="0" w:uiPriority="63" w:unhideWhenUsed="0"/>
+    <w:lsdException w:name="Medium Shading 2 Accent 6" w:semiHidden="0" w:uiPriority="64" w:unhideWhenUsed="0"/>
+    <w:lsdException w:name="Medium List 1 Accent 6" w:semiHidden="0" w:uiPriority="65" w:unhideWhenUsed="0"/>
+    <w:lsdException w:name="Medium List 2 Accent 6" w:semiHidden="0" w:uiPriority="66" w:unhideWhenUsed="0"/>
+    <w:lsdException w:name="Medium Grid 1 Accent 6" w:semiHidden="0" w:uiPriority="67" w:unhideWhenUsed="0"/>
+    <w:lsdException w:name="Medium Grid 2 Accent 6" w:semiHidden="0" w:uiPriority="68" w:unhideWhenUsed="0"/>
+    <w:lsdException w:name="Medium Grid 3 Accent 6" w:semiHidden="0" w:uiPriority="69" w:unhideWhenUsed="0"/>
+    <w:lsdException w:name="Dark List Accent 6" w:semiHidden="0" w:uiPriority="70" w:unhideWhenUsed="0"/>
+    <w:lsdException w:name="Colorful Shading Accent 6" w:semiHidden="0" w:uiPriority="71" w:unhideWhenUsed="0"/>
+    <w:lsdException w:name="Colorful List Accent 6" w:semiHidden="0" w:uiPriority="72" w:unhideWhenUsed="0"/>
+    <w:lsdException w:name="Colorful Grid Accent 6" w:semiHidden="0" w:uiPriority="73" w:unhideWhenUsed="0"/>
+    <w:lsdException w:name="Subtle Emphasis" w:semiHidden="0" w:uiPriority="19" w:unhideWhenUsed="0" w:qFormat="1"/>
+    <w:lsdException w:name="Intense Emphasis" w:semiHidden="0" w:uiPriority="21" w:unhideWhenUsed="0" w:qFormat="1"/>
+    <w:lsdException w:name="Subtle Reference" w:semiHidden="0" w:uiPriority="31" w:unhideWhenUsed="0" w:qFormat="1"/>
+    <w:lsdException w:name="Intense Reference" w:semiHidden="0" w:uiPriority="32" w:unhideWhenUsed="0" w:qFormat="1"/>
+    <w:lsdException w:name="Book Title" w:semiHidden="0" w:uiPriority="33" w:unhideWhenUsed="0" w:qFormat="1"/>
+    <w:lsdException w:name="Bibliography" w:uiPriority="37"/>
+    <w:lsdException w:name="TOC Heading" w:uiPriority="39" w:qFormat="1"/>
+  </w:latentStyles>
+  <w:style w:type="paragraph" w:default="1" w:styleId="Normal">
+    <w:name w:val="Normal"/>
     <w:qFormat/>
-    <w:pPr>
-      <w:jc w:val="both"/>
-    </w:pPr>
+  </w:style>
+  <w:style w:type="character" w:default="1" w:styleId="DefaultParagraphFont">
+    <w:name w:val="Default Paragraph Font"/>
+    <w:uiPriority w:val="1"/>
+    <w:semiHidden/>
+    <w:unhideWhenUsed/>
+  </w:style>
+  <w:style w:type="table" w:default="1" w:styleId="TableNormal">
+    <w:name w:val="Normal Table"/>
+    <w:uiPriority w:val="99"/>
+    <w:semiHidden/>
+    <w:unhideWhenUsed/>
     <w:tblPr>
-      <w:tblBorders>
-        <w:top w:val="single" w:sz="4" w:space="0" w:color="auto"/>
-        <w:left w:val="single" w:sz="4" w:space="0" w:color="auto"/>
-        <w:bottom w:val="single" w:sz="4" w:space="0" w:color="auto"/>
-        <w:right w:val="single" w:sz="4" w:space="0" w:color="auto"/>
-        <w:insideH w:val="single" w:sz="4" w:space="0" w:color="auto"/>
-        <w:insideV w:val="single" w:sz="4" w:space="0" w:color="auto"/>
-      </w:tblBorders>
+      <w:tblInd w:w="0" w:type="dxa"/>
+      <w:tblCellMar>
+        <w:top w:w="0" w:type="dxa"/>
+        <w:left w:w="108" w:type="dxa"/>
+        <w:bottom w:w="0" w:type="dxa"/>
+        <w:right w:w="108" w:type="dxa"/>
+      </w:tblCellMar>
     </w:tblPr>
+  </w:style>
+  <w:style w:type="numbering" w:default="1" w:styleId="NoList">
+    <w:name w:val="No List"/>
+    <w:uiPriority w:val="99"/>
+    <w:semiHidden/>
+    <w:unhideWhenUsed/>
   </w:style>
 </w:styles>
 </file>
@@ -4692,7 +4984,7 @@
 </file>
 
 <file path=customXml/itemProps1.xml><?xml version="1.0" encoding="utf-8"?>
-<ds:datastoreItem xmlns:ds="http://schemas.openxmlformats.org/officeDocument/2006/customXml" ds:itemID="{89662BCC-A8F8-44D3-863F-D5E9583BE06F}">
+<ds:datastoreItem xmlns:ds="http://schemas.openxmlformats.org/officeDocument/2006/customXml" ds:itemID="{8DFD5AB4-4C7D-435F-BFBF-8542FFB20C22}">
   <ds:schemaRefs>
     <ds:schemaRef ds:uri="http://schemas.openxmlformats.org/officeDocument/2006/bibliography"/>
   </ds:schemaRefs>

</xml_diff>